<commit_message>
Update auth and ingestion flow
</commit_message>
<xml_diff>
--- a/SSP.docx
+++ b/SSP.docx
@@ -1,12 +1,12 @@
 
 <file path=word/document.xml><?xml version="1.0" encoding="utf-8"?>
-<w:document xmlns:o="urn:schemas-microsoft-com:office:office" xmlns:r="http://schemas.openxmlformats.org/officeDocument/2006/relationships" xmlns:v="urn:schemas-microsoft-com:vml" xmlns:w="http://schemas.openxmlformats.org/wordprocessingml/2006/main" xmlns:w10="urn:schemas-microsoft-com:office:word" xmlns:wp="http://schemas.openxmlformats.org/drawingml/2006/wordprocessingDrawing" xmlns:wps="http://schemas.microsoft.com/office/word/2010/wordprocessingShape" xmlns:wpg="http://schemas.microsoft.com/office/word/2010/wordprocessingGroup" xmlns:mc="http://schemas.openxmlformats.org/markup-compatibility/2006" xmlns:wp14="http://schemas.microsoft.com/office/word/2010/wordprocessingDrawing" xmlns:w14="http://schemas.microsoft.com/office/word/2010/wordml" xmlns:w15="http://schemas.microsoft.com/office/word/2012/wordml" mc:Ignorable="w14 wp14 w15">
+<w:document xmlns:o="urn:schemas-microsoft-com:office:office" xmlns:r="http://schemas.openxmlformats.org/officeDocument/2006/relationships" xmlns:v="urn:schemas-microsoft-com:vml" xmlns:w="http://schemas.openxmlformats.org/wordprocessingml/2006/main" xmlns:w10="urn:schemas-microsoft-com:office:word" xmlns:wp="http://schemas.openxmlformats.org/drawingml/2006/wordprocessingDrawing" xmlns:pic="http://schemas.openxmlformats.org/drawingml/2006/picture" xmlns:wps="http://schemas.microsoft.com/office/word/2010/wordprocessingShape" xmlns:wpg="http://schemas.microsoft.com/office/word/2010/wordprocessingGroup" xmlns:mc="http://schemas.openxmlformats.org/markup-compatibility/2006" xmlns:wp14="http://schemas.microsoft.com/office/word/2010/wordprocessingDrawing" xmlns:w14="http://schemas.microsoft.com/office/word/2010/wordml" xmlns:w15="http://schemas.microsoft.com/office/word/2012/wordml" mc:Ignorable="w14 wp14 w15">
   <w:body>
     <w:p>
       <w:pPr>
         <w:pStyle w:val="Normal"/>
         <w:bidi w:val="0"/>
-        <w:jc w:val="left"/>
+        <w:jc w:val="start"/>
         <w:rPr/>
       </w:pPr>
       <w:r>
@@ -16,14 +16,14 @@
     <w:tbl>
       <w:tblPr>
         <w:tblW w:w="12240" w:type="dxa"/>
-        <w:jc w:val="left"/>
-        <w:tblInd w:w="-1440" w:type="dxa"/>
+        <w:jc w:val="start"/>
+        <w:tblInd w:w="-1425" w:type="dxa"/>
         <w:tblLayout w:type="fixed"/>
         <w:tblCellMar>
           <w:top w:w="0" w:type="dxa"/>
-          <w:left w:w="15" w:type="dxa"/>
+          <w:start w:w="15" w:type="dxa"/>
           <w:bottom w:w="0" w:type="dxa"/>
-          <w:right w:w="0" w:type="dxa"/>
+          <w:end w:w="0" w:type="dxa"/>
         </w:tblCellMar>
       </w:tblPr>
       <w:tblGrid>
@@ -31,16 +31,14 @@
       </w:tblGrid>
       <w:tr>
         <w:trPr>
-          <w:trHeight w:val="2730" w:hRule="atLeast"/>
+          <w:trHeight w:val="795" w:hRule="atLeast"/>
         </w:trPr>
         <w:tc>
           <w:tcPr>
             <w:tcW w:w="12240" w:type="dxa"/>
             <w:tcBorders>
               <w:top w:val="single" w:sz="12" w:space="0" w:color="1A4480"/>
-              <w:left w:val="single" w:sz="12" w:space="0" w:color="1A4480"/>
             </w:tcBorders>
-            <w:shd w:fill="1A4480" w:val="clear"/>
             <w:vAlign w:val="center"/>
           </w:tcPr>
           <w:p>
@@ -48,76 +46,7 @@
               <w:pStyle w:val="Normal"/>
               <w:widowControl w:val="false"/>
               <w:bidi w:val="0"/>
-              <w:jc w:val="center"/>
-              <w:rPr/>
-            </w:pPr>
-            <w:r>
-              <w:rPr/>
-              <w:drawing>
-                <wp:anchor behindDoc="0" distT="0" distB="0" distL="0" distR="0" simplePos="0" locked="0" layoutInCell="1" allowOverlap="1" relativeHeight="8">
-                  <wp:simplePos x="0" y="0"/>
-                  <wp:positionH relativeFrom="column">
-                    <wp:align>center</wp:align>
-                  </wp:positionH>
-                  <wp:positionV relativeFrom="paragraph">
-                    <wp:posOffset>635</wp:posOffset>
-                  </wp:positionV>
-                  <wp:extent cx="1482725" cy="1482725"/>
-                  <wp:effectExtent l="0" t="0" r="0" b="0"/>
-                  <wp:wrapSquare wrapText="largest"/>
-                  <wp:docPr id="1" name="Image3" descr=""/>
-                  <wp:cNvGraphicFramePr>
-                    <a:graphicFrameLocks xmlns:a="http://schemas.openxmlformats.org/drawingml/2006/main" noChangeAspect="1"/>
-                  </wp:cNvGraphicFramePr>
-                  <a:graphic xmlns:a="http://schemas.openxmlformats.org/drawingml/2006/main">
-                    <a:graphicData uri="http://schemas.openxmlformats.org/drawingml/2006/picture">
-                      <pic:pic xmlns:pic="http://schemas.openxmlformats.org/drawingml/2006/picture">
-                        <pic:nvPicPr>
-                          <pic:cNvPr id="1" name="Image3" descr=""/>
-                          <pic:cNvPicPr>
-                            <a:picLocks noChangeAspect="1" noChangeArrowheads="1"/>
-                          </pic:cNvPicPr>
-                        </pic:nvPicPr>
-                        <pic:blipFill>
-                          <a:blip r:embed="rId2"/>
-                          <a:stretch>
-                            <a:fillRect/>
-                          </a:stretch>
-                        </pic:blipFill>
-                        <pic:spPr bwMode="auto">
-                          <a:xfrm>
-                            <a:off x="0" y="0"/>
-                            <a:ext cx="1482725" cy="1482725"/>
-                          </a:xfrm>
-                          <a:prstGeom prst="rect">
-                            <a:avLst/>
-                          </a:prstGeom>
-                        </pic:spPr>
-                      </pic:pic>
-                    </a:graphicData>
-                  </a:graphic>
-                </wp:anchor>
-              </w:drawing>
-            </w:r>
-          </w:p>
-        </w:tc>
-      </w:tr>
-      <w:tr>
-        <w:trPr>
-          <w:trHeight w:val="795" w:hRule="atLeast"/>
-        </w:trPr>
-        <w:tc>
-          <w:tcPr>
-            <w:tcW w:w="12240" w:type="dxa"/>
-            <w:tcBorders/>
-            <w:vAlign w:val="center"/>
-          </w:tcPr>
-          <w:p>
-            <w:pPr>
-              <w:pStyle w:val="Normal"/>
-              <w:widowControl w:val="false"/>
-              <w:bidi w:val="0"/>
-              <w:jc w:val="left"/>
+              <w:jc w:val="start"/>
               <w:rPr>
                 <w:rFonts w:ascii="Arial" w:hAnsi="Arial" w:cs="Arial"/>
               </w:rPr>
@@ -240,10 +169,9 @@
       <w:pPr>
         <w:pStyle w:val="Normal"/>
         <w:bidi w:val="0"/>
-        <w:jc w:val="left"/>
+        <w:jc w:val="start"/>
         <w:rPr>
           <w:rFonts w:ascii="Arial" w:hAnsi="Arial" w:cs="Arial"/>
-          <w:b/>
           <w:b/>
           <w:bCs/>
         </w:rPr>
@@ -261,7 +189,7 @@
       <w:pPr>
         <w:pStyle w:val="Normal"/>
         <w:bidi w:val="0"/>
-        <w:jc w:val="left"/>
+        <w:jc w:val="start"/>
         <w:rPr>
           <w:rFonts w:ascii="Arial" w:hAnsi="Arial" w:cs="Arial"/>
         </w:rPr>
@@ -277,7 +205,7 @@
       <w:pPr>
         <w:pStyle w:val="Normal"/>
         <w:bidi w:val="0"/>
-        <w:jc w:val="left"/>
+        <w:jc w:val="start"/>
         <w:rPr>
           <w:rFonts w:ascii="Arial" w:hAnsi="Arial" w:cs="Arial"/>
         </w:rPr>
@@ -296,17 +224,17 @@
         <w:tblLayout w:type="fixed"/>
         <w:tblCellMar>
           <w:top w:w="0" w:type="dxa"/>
-          <w:left w:w="108" w:type="dxa"/>
+          <w:start w:w="108" w:type="dxa"/>
           <w:bottom w:w="0" w:type="dxa"/>
-          <w:right w:w="108" w:type="dxa"/>
+          <w:end w:w="108" w:type="dxa"/>
         </w:tblCellMar>
       </w:tblPr>
       <w:tblGrid>
-        <w:gridCol w:w="1108"/>
-        <w:gridCol w:w="2238"/>
-        <w:gridCol w:w="3690"/>
-        <w:gridCol w:w="893"/>
-        <w:gridCol w:w="2042"/>
+        <w:gridCol w:w="1105"/>
+        <w:gridCol w:w="2239"/>
+        <w:gridCol w:w="3692"/>
+        <w:gridCol w:w="891"/>
+        <w:gridCol w:w="2045"/>
       </w:tblGrid>
       <w:tr>
         <w:trPr>
@@ -314,13 +242,13 @@
         </w:trPr>
         <w:tc>
           <w:tcPr>
-            <w:tcW w:w="9971" w:type="dxa"/>
+            <w:tcW w:w="9972" w:type="dxa"/>
             <w:gridSpan w:val="5"/>
             <w:tcBorders>
               <w:top w:val="single" w:sz="4" w:space="0" w:color="000000"/>
-              <w:left w:val="single" w:sz="4" w:space="0" w:color="000000"/>
+              <w:start w:val="single" w:sz="4" w:space="0" w:color="000000"/>
               <w:bottom w:val="single" w:sz="4" w:space="0" w:color="000000"/>
-              <w:right w:val="single" w:sz="4" w:space="0" w:color="000000"/>
+              <w:end w:val="single" w:sz="4" w:space="0" w:color="000000"/>
             </w:tcBorders>
           </w:tcPr>
           <w:p>
@@ -329,7 +257,7 @@
               <w:widowControl w:val="false"/>
               <w:bidi w:val="0"/>
               <w:spacing w:before="60" w:after="60"/>
-              <w:jc w:val="left"/>
+              <w:jc w:val="start"/>
               <w:rPr>
                 <w:rFonts w:cs="Arial"/>
               </w:rPr>
@@ -349,10 +277,10 @@
         </w:trPr>
         <w:tc>
           <w:tcPr>
-            <w:tcW w:w="1108" w:type="dxa"/>
+            <w:tcW w:w="1105" w:type="dxa"/>
             <w:tcBorders>
               <w:top w:val="single" w:sz="4" w:space="0" w:color="000000"/>
-              <w:left w:val="single" w:sz="4" w:space="0" w:color="000000"/>
+              <w:start w:val="single" w:sz="4" w:space="0" w:color="000000"/>
             </w:tcBorders>
             <w:vAlign w:val="center"/>
           </w:tcPr>
@@ -362,7 +290,7 @@
               <w:widowControl w:val="false"/>
               <w:bidi w:val="0"/>
               <w:spacing w:before="60" w:after="60"/>
-              <w:jc w:val="left"/>
+              <w:jc w:val="start"/>
               <w:rPr>
                 <w:rFonts w:ascii="Arial" w:hAnsi="Arial" w:cs="Arial"/>
               </w:rPr>
@@ -377,7 +305,7 @@
         </w:tc>
         <w:tc>
           <w:tcPr>
-            <w:tcW w:w="5928" w:type="dxa"/>
+            <w:tcW w:w="5931" w:type="dxa"/>
             <w:gridSpan w:val="2"/>
             <w:tcBorders>
               <w:top w:val="single" w:sz="4" w:space="0" w:color="000000"/>
@@ -391,7 +319,7 @@
               <w:widowControl w:val="false"/>
               <w:bidi w:val="0"/>
               <w:spacing w:before="60" w:after="60"/>
-              <w:jc w:val="left"/>
+              <w:jc w:val="start"/>
               <w:rPr>
                 <w:rFonts w:cs="Arial"/>
               </w:rPr>
@@ -406,7 +334,7 @@
         </w:tc>
         <w:tc>
           <w:tcPr>
-            <w:tcW w:w="893" w:type="dxa"/>
+            <w:tcW w:w="891" w:type="dxa"/>
             <w:tcBorders>
               <w:top w:val="single" w:sz="4" w:space="0" w:color="000000"/>
             </w:tcBorders>
@@ -433,11 +361,11 @@
         </w:tc>
         <w:tc>
           <w:tcPr>
-            <w:tcW w:w="2042" w:type="dxa"/>
+            <w:tcW w:w="2045" w:type="dxa"/>
             <w:tcBorders>
               <w:top w:val="single" w:sz="4" w:space="0" w:color="000000"/>
               <w:bottom w:val="single" w:sz="4" w:space="0" w:color="000000"/>
-              <w:right w:val="single" w:sz="4" w:space="0" w:color="000000"/>
+              <w:end w:val="single" w:sz="4" w:space="0" w:color="000000"/>
             </w:tcBorders>
             <w:vAlign w:val="center"/>
           </w:tcPr>
@@ -447,7 +375,7 @@
               <w:widowControl w:val="false"/>
               <w:bidi w:val="0"/>
               <w:spacing w:before="60" w:after="60"/>
-              <w:jc w:val="left"/>
+              <w:jc w:val="start"/>
               <w:rPr>
                 <w:rFonts w:cs="Arial"/>
               </w:rPr>
@@ -467,9 +395,9 @@
         </w:trPr>
         <w:tc>
           <w:tcPr>
-            <w:tcW w:w="1108" w:type="dxa"/>
+            <w:tcW w:w="1105" w:type="dxa"/>
             <w:tcBorders>
-              <w:left w:val="single" w:sz="4" w:space="0" w:color="000000"/>
+              <w:start w:val="single" w:sz="4" w:space="0" w:color="000000"/>
               <w:bottom w:val="single" w:sz="4" w:space="0" w:color="000000"/>
             </w:tcBorders>
             <w:vAlign w:val="center"/>
@@ -480,7 +408,7 @@
               <w:widowControl w:val="false"/>
               <w:bidi w:val="0"/>
               <w:spacing w:before="60" w:after="60"/>
-              <w:jc w:val="left"/>
+              <w:jc w:val="start"/>
               <w:rPr>
                 <w:rFonts w:ascii="Arial" w:hAnsi="Arial" w:cs="Arial"/>
               </w:rPr>
@@ -495,11 +423,11 @@
         </w:tc>
         <w:tc>
           <w:tcPr>
-            <w:tcW w:w="8863" w:type="dxa"/>
+            <w:tcW w:w="8867" w:type="dxa"/>
             <w:gridSpan w:val="4"/>
             <w:tcBorders>
               <w:bottom w:val="single" w:sz="4" w:space="0" w:color="000000"/>
-              <w:right w:val="single" w:sz="4" w:space="0" w:color="000000"/>
+              <w:end w:val="single" w:sz="4" w:space="0" w:color="000000"/>
             </w:tcBorders>
             <w:vAlign w:val="center"/>
           </w:tcPr>
@@ -509,7 +437,7 @@
               <w:widowControl w:val="false"/>
               <w:bidi w:val="0"/>
               <w:spacing w:before="60" w:after="60"/>
-              <w:jc w:val="left"/>
+              <w:jc w:val="start"/>
               <w:rPr>
                 <w:rFonts w:cs="Arial"/>
               </w:rPr>
@@ -529,10 +457,10 @@
         </w:trPr>
         <w:tc>
           <w:tcPr>
-            <w:tcW w:w="3346" w:type="dxa"/>
+            <w:tcW w:w="3344" w:type="dxa"/>
             <w:gridSpan w:val="2"/>
             <w:tcBorders>
-              <w:left w:val="single" w:sz="4" w:space="0" w:color="000000"/>
+              <w:start w:val="single" w:sz="4" w:space="0" w:color="000000"/>
             </w:tcBorders>
             <w:vAlign w:val="center"/>
           </w:tcPr>
@@ -542,7 +470,7 @@
               <w:widowControl w:val="false"/>
               <w:bidi w:val="0"/>
               <w:spacing w:before="60" w:after="60"/>
-              <w:jc w:val="left"/>
+              <w:jc w:val="start"/>
               <w:rPr>
                 <w:rFonts w:ascii="Arial" w:hAnsi="Arial" w:cs="Arial"/>
               </w:rPr>
@@ -557,12 +485,12 @@
         </w:tc>
         <w:tc>
           <w:tcPr>
-            <w:tcW w:w="6625" w:type="dxa"/>
+            <w:tcW w:w="6628" w:type="dxa"/>
             <w:gridSpan w:val="3"/>
             <w:tcBorders>
               <w:top w:val="single" w:sz="4" w:space="0" w:color="000000"/>
               <w:bottom w:val="single" w:sz="4" w:space="0" w:color="000000"/>
-              <w:right w:val="single" w:sz="4" w:space="0" w:color="000000"/>
+              <w:end w:val="single" w:sz="4" w:space="0" w:color="000000"/>
             </w:tcBorders>
             <w:vAlign w:val="center"/>
           </w:tcPr>
@@ -572,7 +500,7 @@
               <w:widowControl w:val="false"/>
               <w:bidi w:val="0"/>
               <w:spacing w:before="60" w:after="60"/>
-              <w:jc w:val="left"/>
+              <w:jc w:val="start"/>
               <w:rPr>
                 <w:rFonts w:cs="Arial"/>
               </w:rPr>
@@ -591,7 +519,7 @@
       <w:pPr>
         <w:pStyle w:val="Normal"/>
         <w:bidi w:val="0"/>
-        <w:jc w:val="left"/>
+        <w:jc w:val="start"/>
         <w:rPr>
           <w:rFonts w:ascii="Arial" w:hAnsi="Arial" w:cs="Arial"/>
         </w:rPr>
@@ -610,7 +538,7 @@
           <w:numId w:val="1"/>
         </w:numPr>
         <w:bidi w:val="0"/>
-        <w:jc w:val="left"/>
+        <w:jc w:val="start"/>
         <w:rPr>
           <w:rFonts w:ascii="Arial" w:hAnsi="Arial" w:cs="Arial"/>
         </w:rPr>
@@ -628,7 +556,7 @@
       <w:pPr>
         <w:pStyle w:val="Normal"/>
         <w:bidi w:val="0"/>
-        <w:jc w:val="left"/>
+        <w:jc w:val="start"/>
         <w:rPr>
           <w:rFonts w:ascii="Arial" w:hAnsi="Arial" w:cs="Arial"/>
         </w:rPr>
@@ -642,9 +570,9 @@
     </w:p>
     <w:p>
       <w:pPr>
-        <w:pStyle w:val="Tabletitle"/>
+        <w:pStyle w:val="tabletitle"/>
         <w:bidi w:val="0"/>
-        <w:jc w:val="left"/>
+        <w:jc w:val="start"/>
         <w:rPr>
           <w:rFonts w:ascii="Arial" w:hAnsi="Arial" w:cs="Arial"/>
         </w:rPr>
@@ -659,19 +587,19 @@
     <w:tbl>
       <w:tblPr>
         <w:tblW w:w="9445" w:type="dxa"/>
-        <w:jc w:val="left"/>
+        <w:jc w:val="start"/>
         <w:tblInd w:w="-5" w:type="dxa"/>
         <w:tblLayout w:type="fixed"/>
         <w:tblCellMar>
           <w:top w:w="0" w:type="dxa"/>
-          <w:left w:w="108" w:type="dxa"/>
+          <w:start w:w="108" w:type="dxa"/>
           <w:bottom w:w="0" w:type="dxa"/>
-          <w:right w:w="108" w:type="dxa"/>
+          <w:end w:w="108" w:type="dxa"/>
         </w:tblCellMar>
       </w:tblPr>
       <w:tblGrid>
-        <w:gridCol w:w="2423"/>
-        <w:gridCol w:w="7021"/>
+        <w:gridCol w:w="2421"/>
+        <w:gridCol w:w="7024"/>
       </w:tblGrid>
       <w:tr>
         <w:trPr>
@@ -680,13 +608,13 @@
         </w:trPr>
         <w:tc>
           <w:tcPr>
-            <w:tcW w:w="9444" w:type="dxa"/>
+            <w:tcW w:w="9445" w:type="dxa"/>
             <w:gridSpan w:val="2"/>
             <w:tcBorders>
               <w:top w:val="single" w:sz="4" w:space="0" w:color="B4B4B4"/>
-              <w:left w:val="single" w:sz="4" w:space="0" w:color="B4B4B4"/>
+              <w:start w:val="single" w:sz="4" w:space="0" w:color="B4B4B4"/>
               <w:bottom w:val="single" w:sz="4" w:space="0" w:color="B4B4B4"/>
-              <w:right w:val="single" w:sz="4" w:space="0" w:color="B4B4B4"/>
+              <w:end w:val="single" w:sz="4" w:space="0" w:color="B4B4B4"/>
             </w:tcBorders>
             <w:shd w:fill="CCECFC" w:val="clear"/>
           </w:tcPr>
@@ -696,10 +624,9 @@
               <w:widowControl w:val="false"/>
               <w:bidi w:val="0"/>
               <w:spacing w:lineRule="auto" w:line="288" w:before="80" w:after="80"/>
-              <w:jc w:val="left"/>
+              <w:jc w:val="start"/>
               <w:rPr>
                 <w:rFonts w:ascii="Arial" w:hAnsi="Arial" w:eastAsia="Arial" w:cs="Arial"/>
-                <w:b/>
                 <w:b/>
                 <w:bCs/>
                 <w:kern w:val="0"/>
@@ -725,12 +652,12 @@
         <w:trPr/>
         <w:tc>
           <w:tcPr>
-            <w:tcW w:w="2423" w:type="dxa"/>
+            <w:tcW w:w="2421" w:type="dxa"/>
             <w:tcBorders>
               <w:top w:val="single" w:sz="4" w:space="0" w:color="B4B4B4"/>
-              <w:left w:val="single" w:sz="4" w:space="0" w:color="B4B4B4"/>
+              <w:start w:val="single" w:sz="4" w:space="0" w:color="B4B4B4"/>
               <w:bottom w:val="single" w:sz="4" w:space="0" w:color="B4B4B4"/>
-              <w:right w:val="single" w:sz="4" w:space="0" w:color="B4B4B4"/>
+              <w:end w:val="single" w:sz="4" w:space="0" w:color="B4B4B4"/>
             </w:tcBorders>
             <w:shd w:fill="F0F0F0" w:val="clear"/>
           </w:tcPr>
@@ -740,10 +667,9 @@
               <w:widowControl w:val="false"/>
               <w:bidi w:val="0"/>
               <w:spacing w:lineRule="auto" w:line="288" w:before="80" w:after="80"/>
-              <w:jc w:val="left"/>
+              <w:jc w:val="start"/>
               <w:rPr>
                 <w:rFonts w:ascii="Arial" w:hAnsi="Arial" w:eastAsia="Arial" w:cs="Arial"/>
-                <w:b/>
                 <w:b/>
                 <w:bCs/>
                 <w:kern w:val="0"/>
@@ -766,12 +692,12 @@
         </w:tc>
         <w:tc>
           <w:tcPr>
-            <w:tcW w:w="7021" w:type="dxa"/>
+            <w:tcW w:w="7024" w:type="dxa"/>
             <w:tcBorders>
               <w:top w:val="single" w:sz="4" w:space="0" w:color="B4B4B4"/>
-              <w:left w:val="single" w:sz="4" w:space="0" w:color="B4B4B4"/>
+              <w:start w:val="single" w:sz="4" w:space="0" w:color="B4B4B4"/>
               <w:bottom w:val="single" w:sz="4" w:space="0" w:color="B4B4B4"/>
-              <w:right w:val="single" w:sz="4" w:space="0" w:color="B4B4B4"/>
+              <w:end w:val="single" w:sz="4" w:space="0" w:color="B4B4B4"/>
             </w:tcBorders>
             <w:shd w:fill="F0F0F0" w:val="clear"/>
           </w:tcPr>
@@ -781,7 +707,7 @@
               <w:widowControl w:val="false"/>
               <w:bidi w:val="0"/>
               <w:spacing w:lineRule="auto" w:line="288" w:before="80" w:after="80"/>
-              <w:jc w:val="left"/>
+              <w:jc w:val="start"/>
               <w:rPr>
                 <w:rFonts w:ascii="Arial" w:hAnsi="Arial" w:eastAsia="Arial" w:cs="Arial"/>
                 <w:kern w:val="0"/>
@@ -805,12 +731,12 @@
         <w:trPr/>
         <w:tc>
           <w:tcPr>
-            <w:tcW w:w="2423" w:type="dxa"/>
+            <w:tcW w:w="2421" w:type="dxa"/>
             <w:tcBorders>
               <w:top w:val="single" w:sz="4" w:space="0" w:color="B4B4B4"/>
-              <w:left w:val="single" w:sz="4" w:space="0" w:color="B4B4B4"/>
+              <w:start w:val="single" w:sz="4" w:space="0" w:color="B4B4B4"/>
               <w:bottom w:val="single" w:sz="4" w:space="0" w:color="B4B4B4"/>
-              <w:right w:val="single" w:sz="4" w:space="0" w:color="B4B4B4"/>
+              <w:end w:val="single" w:sz="4" w:space="0" w:color="B4B4B4"/>
             </w:tcBorders>
           </w:tcPr>
           <w:p>
@@ -819,10 +745,9 @@
               <w:widowControl w:val="false"/>
               <w:bidi w:val="0"/>
               <w:spacing w:lineRule="auto" w:line="288" w:before="80" w:after="80"/>
-              <w:jc w:val="left"/>
+              <w:jc w:val="start"/>
               <w:rPr>
                 <w:rFonts w:ascii="Arial" w:hAnsi="Arial" w:cs="Arial"/>
-                <w:b/>
                 <w:b/>
                 <w:bCs/>
                 <w:kern w:val="0"/>
@@ -845,12 +770,12 @@
         </w:tc>
         <w:tc>
           <w:tcPr>
-            <w:tcW w:w="7021" w:type="dxa"/>
+            <w:tcW w:w="7024" w:type="dxa"/>
             <w:tcBorders>
               <w:top w:val="single" w:sz="4" w:space="0" w:color="B4B4B4"/>
-              <w:left w:val="single" w:sz="4" w:space="0" w:color="B4B4B4"/>
+              <w:start w:val="single" w:sz="4" w:space="0" w:color="B4B4B4"/>
               <w:bottom w:val="single" w:sz="4" w:space="0" w:color="B4B4B4"/>
-              <w:right w:val="single" w:sz="4" w:space="0" w:color="B4B4B4"/>
+              <w:end w:val="single" w:sz="4" w:space="0" w:color="B4B4B4"/>
             </w:tcBorders>
           </w:tcPr>
           <w:p>
@@ -859,7 +784,7 @@
               <w:widowControl w:val="false"/>
               <w:bidi w:val="0"/>
               <w:spacing w:lineRule="auto" w:line="288" w:before="80" w:after="80"/>
-              <w:jc w:val="left"/>
+              <w:jc w:val="start"/>
               <w:rPr>
                 <w:rFonts w:ascii="Arial" w:hAnsi="Arial" w:eastAsia="Arial" w:cs="Arial"/>
                 <w:kern w:val="0"/>
@@ -885,12 +810,12 @@
         </w:trPr>
         <w:tc>
           <w:tcPr>
-            <w:tcW w:w="2423" w:type="dxa"/>
+            <w:tcW w:w="2421" w:type="dxa"/>
             <w:tcBorders>
               <w:top w:val="single" w:sz="4" w:space="0" w:color="B4B4B4"/>
-              <w:left w:val="single" w:sz="4" w:space="0" w:color="B4B4B4"/>
+              <w:start w:val="single" w:sz="4" w:space="0" w:color="B4B4B4"/>
               <w:bottom w:val="single" w:sz="4" w:space="0" w:color="B4B4B4"/>
-              <w:right w:val="single" w:sz="4" w:space="0" w:color="B4B4B4"/>
+              <w:end w:val="single" w:sz="4" w:space="0" w:color="B4B4B4"/>
             </w:tcBorders>
             <w:shd w:fill="F0F0F0" w:val="clear"/>
           </w:tcPr>
@@ -900,10 +825,9 @@
               <w:widowControl w:val="false"/>
               <w:bidi w:val="0"/>
               <w:spacing w:lineRule="auto" w:line="288" w:before="80" w:after="80"/>
-              <w:jc w:val="left"/>
+              <w:jc w:val="start"/>
               <w:rPr>
                 <w:rFonts w:ascii="Arial" w:hAnsi="Arial" w:cs="Arial"/>
-                <w:b/>
                 <w:b/>
                 <w:bCs/>
                 <w:kern w:val="0"/>
@@ -926,12 +850,12 @@
         </w:tc>
         <w:tc>
           <w:tcPr>
-            <w:tcW w:w="7021" w:type="dxa"/>
+            <w:tcW w:w="7024" w:type="dxa"/>
             <w:tcBorders>
               <w:top w:val="single" w:sz="4" w:space="0" w:color="B4B4B4"/>
-              <w:left w:val="single" w:sz="4" w:space="0" w:color="B4B4B4"/>
+              <w:start w:val="single" w:sz="4" w:space="0" w:color="B4B4B4"/>
               <w:bottom w:val="single" w:sz="4" w:space="0" w:color="B4B4B4"/>
-              <w:right w:val="single" w:sz="4" w:space="0" w:color="B4B4B4"/>
+              <w:end w:val="single" w:sz="4" w:space="0" w:color="B4B4B4"/>
             </w:tcBorders>
             <w:shd w:fill="F0F0F0" w:val="clear"/>
           </w:tcPr>
@@ -941,7 +865,7 @@
               <w:widowControl w:val="false"/>
               <w:bidi w:val="0"/>
               <w:spacing w:lineRule="auto" w:line="288" w:before="80" w:after="80"/>
-              <w:jc w:val="left"/>
+              <w:jc w:val="start"/>
               <w:rPr>
                 <w:rFonts w:ascii="Arial" w:hAnsi="Arial" w:eastAsia="Arial" w:cs="Arial"/>
                 <w:kern w:val="0"/>
@@ -967,12 +891,12 @@
         </w:trPr>
         <w:tc>
           <w:tcPr>
-            <w:tcW w:w="2423" w:type="dxa"/>
+            <w:tcW w:w="2421" w:type="dxa"/>
             <w:tcBorders>
               <w:top w:val="single" w:sz="4" w:space="0" w:color="B4B4B4"/>
-              <w:left w:val="single" w:sz="4" w:space="0" w:color="B4B4B4"/>
+              <w:start w:val="single" w:sz="4" w:space="0" w:color="B4B4B4"/>
               <w:bottom w:val="single" w:sz="4" w:space="0" w:color="B4B4B4"/>
-              <w:right w:val="single" w:sz="4" w:space="0" w:color="B4B4B4"/>
+              <w:end w:val="single" w:sz="4" w:space="0" w:color="B4B4B4"/>
             </w:tcBorders>
             <w:shd w:fill="F0F0F0" w:val="clear"/>
           </w:tcPr>
@@ -982,10 +906,9 @@
               <w:widowControl w:val="false"/>
               <w:bidi w:val="0"/>
               <w:spacing w:lineRule="auto" w:line="288" w:before="80" w:after="80"/>
-              <w:jc w:val="left"/>
+              <w:jc w:val="start"/>
               <w:rPr>
                 <w:rFonts w:ascii="Arial" w:hAnsi="Arial" w:eastAsia="Arial" w:cs="Arial"/>
-                <w:b/>
                 <w:b/>
                 <w:bCs/>
                 <w:kern w:val="0"/>
@@ -1008,12 +931,12 @@
         </w:tc>
         <w:tc>
           <w:tcPr>
-            <w:tcW w:w="7021" w:type="dxa"/>
+            <w:tcW w:w="7024" w:type="dxa"/>
             <w:tcBorders>
               <w:top w:val="single" w:sz="4" w:space="0" w:color="B4B4B4"/>
-              <w:left w:val="single" w:sz="4" w:space="0" w:color="B4B4B4"/>
+              <w:start w:val="single" w:sz="4" w:space="0" w:color="B4B4B4"/>
               <w:bottom w:val="single" w:sz="4" w:space="0" w:color="B4B4B4"/>
-              <w:right w:val="single" w:sz="4" w:space="0" w:color="B4B4B4"/>
+              <w:end w:val="single" w:sz="4" w:space="0" w:color="B4B4B4"/>
             </w:tcBorders>
             <w:shd w:fill="F0F0F0" w:val="clear"/>
           </w:tcPr>
@@ -1023,7 +946,7 @@
               <w:widowControl w:val="false"/>
               <w:bidi w:val="0"/>
               <w:spacing w:lineRule="auto" w:line="288" w:before="80" w:after="80"/>
-              <w:jc w:val="left"/>
+              <w:jc w:val="start"/>
               <w:rPr>
                 <w:rFonts w:ascii="Arial" w:hAnsi="Arial" w:eastAsia="Arial" w:cs="Arial"/>
                 <w:kern w:val="0"/>
@@ -1049,12 +972,12 @@
         </w:trPr>
         <w:tc>
           <w:tcPr>
-            <w:tcW w:w="2423" w:type="dxa"/>
+            <w:tcW w:w="2421" w:type="dxa"/>
             <w:tcBorders>
               <w:top w:val="single" w:sz="4" w:space="0" w:color="B4B4B4"/>
-              <w:left w:val="single" w:sz="4" w:space="0" w:color="B4B4B4"/>
+              <w:start w:val="single" w:sz="4" w:space="0" w:color="B4B4B4"/>
               <w:bottom w:val="single" w:sz="4" w:space="0" w:color="B4B4B4"/>
-              <w:right w:val="single" w:sz="4" w:space="0" w:color="B4B4B4"/>
+              <w:end w:val="single" w:sz="4" w:space="0" w:color="B4B4B4"/>
             </w:tcBorders>
           </w:tcPr>
           <w:p>
@@ -1063,10 +986,9 @@
               <w:widowControl w:val="false"/>
               <w:bidi w:val="0"/>
               <w:spacing w:lineRule="auto" w:line="288" w:before="80" w:after="80"/>
-              <w:jc w:val="left"/>
+              <w:jc w:val="start"/>
               <w:rPr>
                 <w:rFonts w:ascii="Arial" w:hAnsi="Arial" w:eastAsia="Arial" w:cs="Arial"/>
-                <w:b/>
                 <w:b/>
                 <w:bCs/>
                 <w:kern w:val="0"/>
@@ -1089,12 +1011,12 @@
         </w:tc>
         <w:tc>
           <w:tcPr>
-            <w:tcW w:w="7021" w:type="dxa"/>
+            <w:tcW w:w="7024" w:type="dxa"/>
             <w:tcBorders>
               <w:top w:val="single" w:sz="4" w:space="0" w:color="B4B4B4"/>
-              <w:left w:val="single" w:sz="4" w:space="0" w:color="B4B4B4"/>
+              <w:start w:val="single" w:sz="4" w:space="0" w:color="B4B4B4"/>
               <w:bottom w:val="single" w:sz="4" w:space="0" w:color="B4B4B4"/>
-              <w:right w:val="single" w:sz="4" w:space="0" w:color="B4B4B4"/>
+              <w:end w:val="single" w:sz="4" w:space="0" w:color="B4B4B4"/>
             </w:tcBorders>
           </w:tcPr>
           <w:p>
@@ -1103,7 +1025,7 @@
               <w:widowControl w:val="false"/>
               <w:bidi w:val="0"/>
               <w:spacing w:lineRule="auto" w:line="288" w:before="80" w:after="80"/>
-              <w:jc w:val="left"/>
+              <w:jc w:val="start"/>
               <w:rPr>
                 <w:rFonts w:ascii="Arial" w:hAnsi="Arial" w:eastAsia="Arial" w:cs="Arial"/>
                 <w:kern w:val="0"/>
@@ -1132,7 +1054,7 @@
           <w:numId w:val="1"/>
         </w:numPr>
         <w:bidi w:val="0"/>
-        <w:jc w:val="left"/>
+        <w:jc w:val="start"/>
         <w:rPr>
           <w:rFonts w:ascii="Arial" w:hAnsi="Arial" w:cs="Arial"/>
         </w:rPr>
@@ -1150,7 +1072,8 @@
       <w:pPr>
         <w:pStyle w:val="Normal"/>
         <w:bidi w:val="0"/>
-        <w:jc w:val="left"/>
+        <w:spacing w:before="0" w:after="0"/>
+        <w:jc w:val="start"/>
         <w:rPr>
           <w:rFonts w:ascii="Arial" w:hAnsi="Arial" w:cs="Arial"/>
         </w:rPr>
@@ -1164,19 +1087,19 @@
     <w:tbl>
       <w:tblPr>
         <w:tblW w:w="9445" w:type="dxa"/>
-        <w:jc w:val="left"/>
+        <w:jc w:val="start"/>
         <w:tblInd w:w="0" w:type="dxa"/>
         <w:tblLayout w:type="fixed"/>
         <w:tblCellMar>
           <w:top w:w="0" w:type="dxa"/>
-          <w:left w:w="108" w:type="dxa"/>
+          <w:start w:w="108" w:type="dxa"/>
           <w:bottom w:w="0" w:type="dxa"/>
-          <w:right w:w="108" w:type="dxa"/>
+          <w:end w:w="108" w:type="dxa"/>
         </w:tblCellMar>
       </w:tblPr>
       <w:tblGrid>
-        <w:gridCol w:w="2423"/>
-        <w:gridCol w:w="7021"/>
+        <w:gridCol w:w="2421"/>
+        <w:gridCol w:w="7024"/>
       </w:tblGrid>
       <w:tr>
         <w:trPr>
@@ -1185,13 +1108,13 @@
         </w:trPr>
         <w:tc>
           <w:tcPr>
-            <w:tcW w:w="9444" w:type="dxa"/>
+            <w:tcW w:w="9445" w:type="dxa"/>
             <w:gridSpan w:val="2"/>
             <w:tcBorders>
               <w:top w:val="single" w:sz="4" w:space="0" w:color="B4B4B4"/>
-              <w:left w:val="single" w:sz="4" w:space="0" w:color="B4B4B4"/>
+              <w:start w:val="single" w:sz="4" w:space="0" w:color="B4B4B4"/>
               <w:bottom w:val="single" w:sz="4" w:space="0" w:color="B4B4B4"/>
-              <w:right w:val="single" w:sz="4" w:space="0" w:color="B4B4B4"/>
+              <w:end w:val="single" w:sz="4" w:space="0" w:color="B4B4B4"/>
             </w:tcBorders>
           </w:tcPr>
           <w:p>
@@ -1200,10 +1123,9 @@
               <w:widowControl w:val="false"/>
               <w:bidi w:val="0"/>
               <w:spacing w:lineRule="auto" w:line="288" w:before="80" w:after="80"/>
-              <w:jc w:val="left"/>
+              <w:jc w:val="start"/>
               <w:rPr>
                 <w:rFonts w:ascii="Arial" w:hAnsi="Arial" w:cs="Arial"/>
-                <w:b/>
                 <w:b/>
                 <w:bCs/>
                 <w:szCs w:val="22"/>
@@ -1225,12 +1147,12 @@
         <w:trPr/>
         <w:tc>
           <w:tcPr>
-            <w:tcW w:w="2423" w:type="dxa"/>
+            <w:tcW w:w="2421" w:type="dxa"/>
             <w:tcBorders>
               <w:top w:val="single" w:sz="4" w:space="0" w:color="B4B4B4"/>
-              <w:left w:val="single" w:sz="4" w:space="0" w:color="B4B4B4"/>
+              <w:start w:val="single" w:sz="4" w:space="0" w:color="B4B4B4"/>
               <w:bottom w:val="single" w:sz="4" w:space="0" w:color="B4B4B4"/>
-              <w:right w:val="single" w:sz="4" w:space="0" w:color="B4B4B4"/>
+              <w:end w:val="single" w:sz="4" w:space="0" w:color="B4B4B4"/>
             </w:tcBorders>
           </w:tcPr>
           <w:p>
@@ -1239,10 +1161,9 @@
               <w:widowControl w:val="false"/>
               <w:bidi w:val="0"/>
               <w:spacing w:lineRule="auto" w:line="288" w:before="80" w:after="80"/>
-              <w:jc w:val="left"/>
+              <w:jc w:val="start"/>
               <w:rPr>
                 <w:rFonts w:ascii="Arial" w:hAnsi="Arial" w:cs="Arial"/>
-                <w:b/>
                 <w:b/>
                 <w:bCs/>
                 <w:color w:val="000000"/>
@@ -1263,12 +1184,12 @@
         </w:tc>
         <w:tc>
           <w:tcPr>
-            <w:tcW w:w="7021" w:type="dxa"/>
+            <w:tcW w:w="7024" w:type="dxa"/>
             <w:tcBorders>
               <w:top w:val="single" w:sz="4" w:space="0" w:color="B4B4B4"/>
-              <w:left w:val="single" w:sz="4" w:space="0" w:color="B4B4B4"/>
+              <w:start w:val="single" w:sz="4" w:space="0" w:color="B4B4B4"/>
               <w:bottom w:val="single" w:sz="4" w:space="0" w:color="B4B4B4"/>
-              <w:right w:val="single" w:sz="4" w:space="0" w:color="B4B4B4"/>
+              <w:end w:val="single" w:sz="4" w:space="0" w:color="B4B4B4"/>
             </w:tcBorders>
           </w:tcPr>
           <w:p>
@@ -1277,7 +1198,7 @@
               <w:widowControl w:val="false"/>
               <w:bidi w:val="0"/>
               <w:spacing w:lineRule="auto" w:line="288" w:before="80" w:after="80"/>
-              <w:jc w:val="left"/>
+              <w:jc w:val="start"/>
               <w:rPr>
                 <w:rFonts w:ascii="Arial" w:hAnsi="Arial" w:cs="Arial"/>
                 <w:color w:val="808080"/>
@@ -1299,12 +1220,12 @@
         <w:trPr/>
         <w:tc>
           <w:tcPr>
-            <w:tcW w:w="2423" w:type="dxa"/>
+            <w:tcW w:w="2421" w:type="dxa"/>
             <w:tcBorders>
               <w:top w:val="single" w:sz="4" w:space="0" w:color="B4B4B4"/>
-              <w:left w:val="single" w:sz="4" w:space="0" w:color="B4B4B4"/>
+              <w:start w:val="single" w:sz="4" w:space="0" w:color="B4B4B4"/>
               <w:bottom w:val="single" w:sz="4" w:space="0" w:color="B4B4B4"/>
-              <w:right w:val="single" w:sz="4" w:space="0" w:color="B4B4B4"/>
+              <w:end w:val="single" w:sz="4" w:space="0" w:color="B4B4B4"/>
             </w:tcBorders>
           </w:tcPr>
           <w:p>
@@ -1313,10 +1234,9 @@
               <w:widowControl w:val="false"/>
               <w:bidi w:val="0"/>
               <w:spacing w:lineRule="auto" w:line="288" w:before="80" w:after="80"/>
-              <w:jc w:val="left"/>
+              <w:jc w:val="start"/>
               <w:rPr>
                 <w:rFonts w:ascii="Arial" w:hAnsi="Arial" w:cs="Arial"/>
-                <w:b/>
                 <w:b/>
                 <w:bCs/>
                 <w:color w:val="000000"/>
@@ -1337,12 +1257,12 @@
         </w:tc>
         <w:tc>
           <w:tcPr>
-            <w:tcW w:w="7021" w:type="dxa"/>
+            <w:tcW w:w="7024" w:type="dxa"/>
             <w:tcBorders>
               <w:top w:val="single" w:sz="4" w:space="0" w:color="B4B4B4"/>
-              <w:left w:val="single" w:sz="4" w:space="0" w:color="B4B4B4"/>
+              <w:start w:val="single" w:sz="4" w:space="0" w:color="B4B4B4"/>
               <w:bottom w:val="single" w:sz="4" w:space="0" w:color="B4B4B4"/>
-              <w:right w:val="single" w:sz="4" w:space="0" w:color="B4B4B4"/>
+              <w:end w:val="single" w:sz="4" w:space="0" w:color="B4B4B4"/>
             </w:tcBorders>
           </w:tcPr>
           <w:p>
@@ -1351,7 +1271,7 @@
               <w:widowControl w:val="false"/>
               <w:bidi w:val="0"/>
               <w:spacing w:lineRule="auto" w:line="288" w:before="80" w:after="80"/>
-              <w:jc w:val="left"/>
+              <w:jc w:val="start"/>
               <w:rPr>
                 <w:rFonts w:ascii="Arial" w:hAnsi="Arial" w:cs="Arial"/>
                 <w:color w:val="808080"/>
@@ -1375,12 +1295,12 @@
         </w:trPr>
         <w:tc>
           <w:tcPr>
-            <w:tcW w:w="2423" w:type="dxa"/>
+            <w:tcW w:w="2421" w:type="dxa"/>
             <w:tcBorders>
               <w:top w:val="single" w:sz="4" w:space="0" w:color="B4B4B4"/>
-              <w:left w:val="single" w:sz="4" w:space="0" w:color="B4B4B4"/>
+              <w:start w:val="single" w:sz="4" w:space="0" w:color="B4B4B4"/>
               <w:bottom w:val="single" w:sz="4" w:space="0" w:color="B4B4B4"/>
-              <w:right w:val="single" w:sz="4" w:space="0" w:color="B4B4B4"/>
+              <w:end w:val="single" w:sz="4" w:space="0" w:color="B4B4B4"/>
             </w:tcBorders>
           </w:tcPr>
           <w:p>
@@ -1389,10 +1309,9 @@
               <w:widowControl w:val="false"/>
               <w:bidi w:val="0"/>
               <w:spacing w:lineRule="auto" w:line="288" w:before="80" w:after="80"/>
-              <w:jc w:val="left"/>
+              <w:jc w:val="start"/>
               <w:rPr>
                 <w:rFonts w:ascii="Arial" w:hAnsi="Arial" w:cs="Arial"/>
-                <w:b/>
                 <w:b/>
                 <w:bCs/>
                 <w:color w:val="000000"/>
@@ -1413,12 +1332,12 @@
         </w:tc>
         <w:tc>
           <w:tcPr>
-            <w:tcW w:w="7021" w:type="dxa"/>
+            <w:tcW w:w="7024" w:type="dxa"/>
             <w:tcBorders>
               <w:top w:val="single" w:sz="4" w:space="0" w:color="B4B4B4"/>
-              <w:left w:val="single" w:sz="4" w:space="0" w:color="B4B4B4"/>
+              <w:start w:val="single" w:sz="4" w:space="0" w:color="B4B4B4"/>
               <w:bottom w:val="single" w:sz="4" w:space="0" w:color="B4B4B4"/>
-              <w:right w:val="single" w:sz="4" w:space="0" w:color="B4B4B4"/>
+              <w:end w:val="single" w:sz="4" w:space="0" w:color="B4B4B4"/>
             </w:tcBorders>
           </w:tcPr>
           <w:p>
@@ -1427,7 +1346,7 @@
               <w:widowControl w:val="false"/>
               <w:bidi w:val="0"/>
               <w:spacing w:lineRule="auto" w:line="288" w:before="80" w:after="80"/>
-              <w:jc w:val="left"/>
+              <w:jc w:val="start"/>
               <w:rPr>
                 <w:rFonts w:ascii="Arial" w:hAnsi="Arial" w:cs="Arial"/>
                 <w:color w:val="808080"/>
@@ -1451,12 +1370,12 @@
         </w:trPr>
         <w:tc>
           <w:tcPr>
-            <w:tcW w:w="2423" w:type="dxa"/>
+            <w:tcW w:w="2421" w:type="dxa"/>
             <w:tcBorders>
               <w:top w:val="single" w:sz="4" w:space="0" w:color="B4B4B4"/>
-              <w:left w:val="single" w:sz="4" w:space="0" w:color="B4B4B4"/>
+              <w:start w:val="single" w:sz="4" w:space="0" w:color="B4B4B4"/>
               <w:bottom w:val="single" w:sz="4" w:space="0" w:color="B4B4B4"/>
-              <w:right w:val="single" w:sz="4" w:space="0" w:color="B4B4B4"/>
+              <w:end w:val="single" w:sz="4" w:space="0" w:color="B4B4B4"/>
             </w:tcBorders>
           </w:tcPr>
           <w:p>
@@ -1465,10 +1384,9 @@
               <w:widowControl w:val="false"/>
               <w:bidi w:val="0"/>
               <w:spacing w:lineRule="auto" w:line="288" w:before="80" w:after="80"/>
-              <w:jc w:val="left"/>
+              <w:jc w:val="start"/>
               <w:rPr>
                 <w:rFonts w:ascii="Arial" w:hAnsi="Arial" w:cs="Arial"/>
-                <w:b/>
                 <w:b/>
                 <w:bCs/>
                 <w:color w:val="000000"/>
@@ -1489,12 +1407,12 @@
         </w:tc>
         <w:tc>
           <w:tcPr>
-            <w:tcW w:w="7021" w:type="dxa"/>
+            <w:tcW w:w="7024" w:type="dxa"/>
             <w:tcBorders>
               <w:top w:val="single" w:sz="4" w:space="0" w:color="B4B4B4"/>
-              <w:left w:val="single" w:sz="4" w:space="0" w:color="B4B4B4"/>
+              <w:start w:val="single" w:sz="4" w:space="0" w:color="B4B4B4"/>
               <w:bottom w:val="single" w:sz="4" w:space="0" w:color="B4B4B4"/>
-              <w:right w:val="single" w:sz="4" w:space="0" w:color="B4B4B4"/>
+              <w:end w:val="single" w:sz="4" w:space="0" w:color="B4B4B4"/>
             </w:tcBorders>
           </w:tcPr>
           <w:p>
@@ -1503,7 +1421,7 @@
               <w:widowControl w:val="false"/>
               <w:bidi w:val="0"/>
               <w:spacing w:lineRule="auto" w:line="288" w:before="80" w:after="80"/>
-              <w:jc w:val="left"/>
+              <w:jc w:val="start"/>
               <w:rPr>
                 <w:rFonts w:ascii="Arial" w:hAnsi="Arial" w:cs="Arial"/>
                 <w:color w:val="808080"/>
@@ -1527,12 +1445,12 @@
         </w:trPr>
         <w:tc>
           <w:tcPr>
-            <w:tcW w:w="2423" w:type="dxa"/>
+            <w:tcW w:w="2421" w:type="dxa"/>
             <w:tcBorders>
               <w:top w:val="single" w:sz="4" w:space="0" w:color="B4B4B4"/>
-              <w:left w:val="single" w:sz="4" w:space="0" w:color="B4B4B4"/>
+              <w:start w:val="single" w:sz="4" w:space="0" w:color="B4B4B4"/>
               <w:bottom w:val="single" w:sz="4" w:space="0" w:color="B4B4B4"/>
-              <w:right w:val="single" w:sz="4" w:space="0" w:color="B4B4B4"/>
+              <w:end w:val="single" w:sz="4" w:space="0" w:color="B4B4B4"/>
             </w:tcBorders>
           </w:tcPr>
           <w:p>
@@ -1541,10 +1459,9 @@
               <w:widowControl w:val="false"/>
               <w:bidi w:val="0"/>
               <w:spacing w:lineRule="auto" w:line="288" w:before="80" w:after="80"/>
-              <w:jc w:val="left"/>
+              <w:jc w:val="start"/>
               <w:rPr>
                 <w:rFonts w:ascii="Arial" w:hAnsi="Arial" w:cs="Arial"/>
-                <w:b/>
                 <w:b/>
                 <w:bCs/>
                 <w:color w:val="000000"/>
@@ -1565,12 +1482,12 @@
         </w:tc>
         <w:tc>
           <w:tcPr>
-            <w:tcW w:w="7021" w:type="dxa"/>
+            <w:tcW w:w="7024" w:type="dxa"/>
             <w:tcBorders>
               <w:top w:val="single" w:sz="4" w:space="0" w:color="B4B4B4"/>
-              <w:left w:val="single" w:sz="4" w:space="0" w:color="B4B4B4"/>
+              <w:start w:val="single" w:sz="4" w:space="0" w:color="B4B4B4"/>
               <w:bottom w:val="single" w:sz="4" w:space="0" w:color="B4B4B4"/>
-              <w:right w:val="single" w:sz="4" w:space="0" w:color="B4B4B4"/>
+              <w:end w:val="single" w:sz="4" w:space="0" w:color="B4B4B4"/>
             </w:tcBorders>
           </w:tcPr>
           <w:p>
@@ -1579,7 +1496,7 @@
               <w:widowControl w:val="false"/>
               <w:bidi w:val="0"/>
               <w:spacing w:lineRule="auto" w:line="288" w:before="80" w:after="80"/>
-              <w:jc w:val="left"/>
+              <w:jc w:val="start"/>
               <w:rPr>
                 <w:rFonts w:ascii="Arial" w:hAnsi="Arial" w:cs="Arial"/>
                 <w:color w:val="808080"/>
@@ -1619,7 +1536,7 @@
           <w:numId w:val="1"/>
         </w:numPr>
         <w:bidi w:val="0"/>
-        <w:jc w:val="left"/>
+        <w:jc w:val="start"/>
         <w:rPr/>
       </w:pPr>
       <w:bookmarkStart w:id="5" w:name="_Toc132928036"/>
@@ -1641,7 +1558,7 @@
       <w:pPr>
         <w:pStyle w:val="Normal"/>
         <w:bidi w:val="0"/>
-        <w:jc w:val="left"/>
+        <w:jc w:val="start"/>
         <w:rPr/>
       </w:pPr>
       <w:r>
@@ -1657,7 +1574,7 @@
             <wp:extent cx="4055110" cy="2885440"/>
             <wp:effectExtent l="0" t="0" r="0" b="0"/>
             <wp:wrapSquare wrapText="largest"/>
-            <wp:docPr id="2" name="Image2" descr=""/>
+            <wp:docPr id="1" name="Image2"/>
             <wp:cNvGraphicFramePr>
               <a:graphicFrameLocks xmlns:a="http://schemas.openxmlformats.org/drawingml/2006/main" noChangeAspect="1"/>
             </wp:cNvGraphicFramePr>
@@ -1665,13 +1582,13 @@
               <a:graphicData uri="http://schemas.openxmlformats.org/drawingml/2006/picture">
                 <pic:pic xmlns:pic="http://schemas.openxmlformats.org/drawingml/2006/picture">
                   <pic:nvPicPr>
-                    <pic:cNvPr id="2" name="Image2" descr=""/>
+                    <pic:cNvPr id="1" name="Image2"/>
                     <pic:cNvPicPr>
                       <a:picLocks noChangeAspect="1" noChangeArrowheads="1"/>
                     </pic:cNvPicPr>
                   </pic:nvPicPr>
                   <pic:blipFill>
-                    <a:blip r:embed="rId3"/>
+                    <a:blip r:embed="rId2"/>
                     <a:stretch>
                       <a:fillRect/>
                     </a:stretch>
@@ -1684,6 +1601,7 @@
                     <a:prstGeom prst="rect">
                       <a:avLst/>
                     </a:prstGeom>
+                    <a:noFill/>
                   </pic:spPr>
                 </pic:pic>
               </a:graphicData>
@@ -1748,10 +1666,10 @@
     </w:p>
     <w:p>
       <w:pPr>
-        <w:pStyle w:val="TextBody"/>
+        <w:pStyle w:val="BodyText"/>
         <w:bidi w:val="0"/>
         <w:spacing w:lineRule="auto" w:line="276" w:before="0" w:after="140"/>
-        <w:jc w:val="left"/>
+        <w:jc w:val="start"/>
         <w:rPr/>
       </w:pPr>
       <w:r>
@@ -1760,10 +1678,10 @@
     </w:p>
     <w:p>
       <w:pPr>
-        <w:pStyle w:val="TextBody"/>
+        <w:pStyle w:val="BodyText"/>
         <w:bidi w:val="0"/>
         <w:spacing w:lineRule="auto" w:line="276" w:before="0" w:after="140"/>
-        <w:jc w:val="left"/>
+        <w:jc w:val="start"/>
         <w:rPr/>
       </w:pPr>
       <w:r>
@@ -1833,10 +1751,10 @@
     </w:p>
     <w:p>
       <w:pPr>
-        <w:pStyle w:val="TextBody"/>
+        <w:pStyle w:val="BodyText"/>
         <w:bidi w:val="0"/>
         <w:spacing w:lineRule="auto" w:line="276" w:before="0" w:after="140"/>
-        <w:jc w:val="left"/>
+        <w:jc w:val="start"/>
         <w:rPr/>
       </w:pPr>
       <w:r>
@@ -1845,10 +1763,10 @@
     </w:p>
     <w:p>
       <w:pPr>
-        <w:pStyle w:val="TextBody"/>
+        <w:pStyle w:val="BodyText"/>
         <w:bidi w:val="0"/>
         <w:spacing w:lineRule="auto" w:line="276" w:before="0" w:after="140"/>
-        <w:jc w:val="left"/>
+        <w:jc w:val="start"/>
         <w:rPr/>
       </w:pPr>
       <w:r>
@@ -1898,10 +1816,10 @@
     </w:p>
     <w:p>
       <w:pPr>
-        <w:pStyle w:val="TextBody"/>
+        <w:pStyle w:val="BodyText"/>
         <w:bidi w:val="0"/>
         <w:spacing w:lineRule="auto" w:line="276" w:before="0" w:after="140"/>
-        <w:jc w:val="left"/>
+        <w:jc w:val="start"/>
         <w:rPr/>
       </w:pPr>
       <w:r>
@@ -1910,10 +1828,10 @@
     </w:p>
     <w:p>
       <w:pPr>
-        <w:pStyle w:val="TextBody"/>
+        <w:pStyle w:val="BodyText"/>
         <w:bidi w:val="0"/>
         <w:spacing w:lineRule="auto" w:line="276" w:before="0" w:after="140"/>
-        <w:jc w:val="left"/>
+        <w:jc w:val="start"/>
         <w:rPr/>
       </w:pPr>
       <w:r>
@@ -1963,10 +1881,10 @@
     </w:p>
     <w:p>
       <w:pPr>
-        <w:pStyle w:val="TextBody"/>
+        <w:pStyle w:val="BodyText"/>
         <w:bidi w:val="0"/>
         <w:spacing w:lineRule="auto" w:line="276" w:before="0" w:after="140"/>
-        <w:jc w:val="left"/>
+        <w:jc w:val="start"/>
         <w:rPr/>
       </w:pPr>
       <w:r>
@@ -1975,10 +1893,10 @@
     </w:p>
     <w:p>
       <w:pPr>
-        <w:pStyle w:val="TextBody"/>
+        <w:pStyle w:val="BodyText"/>
         <w:bidi w:val="0"/>
         <w:spacing w:lineRule="auto" w:line="276" w:before="0" w:after="140"/>
-        <w:jc w:val="left"/>
+        <w:jc w:val="start"/>
         <w:rPr/>
       </w:pPr>
       <w:r>
@@ -2030,7 +1948,7 @@
       <w:pPr>
         <w:pStyle w:val="Normal"/>
         <w:bidi w:val="0"/>
-        <w:jc w:val="left"/>
+        <w:jc w:val="start"/>
         <w:rPr>
           <w:rFonts w:ascii="Arial" w:hAnsi="Arial" w:cs="Arial"/>
         </w:rPr>
@@ -2044,14 +1962,14 @@
     <w:tbl>
       <w:tblPr>
         <w:tblW w:w="9350" w:type="dxa"/>
-        <w:jc w:val="left"/>
+        <w:jc w:val="start"/>
         <w:tblInd w:w="0" w:type="dxa"/>
         <w:tblLayout w:type="fixed"/>
         <w:tblCellMar>
           <w:top w:w="0" w:type="dxa"/>
-          <w:left w:w="108" w:type="dxa"/>
+          <w:start w:w="108" w:type="dxa"/>
           <w:bottom w:w="0" w:type="dxa"/>
-          <w:right w:w="108" w:type="dxa"/>
+          <w:end w:w="108" w:type="dxa"/>
         </w:tblCellMar>
       </w:tblPr>
       <w:tblGrid>
@@ -2064,9 +1982,9 @@
             <w:tcW w:w="9350" w:type="dxa"/>
             <w:tcBorders>
               <w:top w:val="single" w:sz="4" w:space="0" w:color="000000"/>
-              <w:left w:val="single" w:sz="4" w:space="0" w:color="000000"/>
+              <w:start w:val="single" w:sz="4" w:space="0" w:color="000000"/>
               <w:bottom w:val="single" w:sz="4" w:space="0" w:color="000000"/>
-              <w:right w:val="single" w:sz="4" w:space="0" w:color="000000"/>
+              <w:end w:val="single" w:sz="4" w:space="0" w:color="000000"/>
             </w:tcBorders>
             <w:shd w:fill="CCECFC" w:val="clear"/>
           </w:tcPr>
@@ -2075,10 +1993,9 @@
               <w:pStyle w:val="Normal"/>
               <w:widowControl w:val="false"/>
               <w:bidi w:val="0"/>
-              <w:jc w:val="left"/>
+              <w:jc w:val="start"/>
               <w:rPr>
                 <w:rFonts w:ascii="Arial" w:hAnsi="Arial" w:cs="Arial"/>
-                <w:b/>
                 <w:b/>
                 <w:lang w:val="en-US"/>
               </w:rPr>
@@ -2101,9 +2018,9 @@
             <w:tcW w:w="9350" w:type="dxa"/>
             <w:tcBorders>
               <w:top w:val="single" w:sz="4" w:space="0" w:color="000000"/>
-              <w:left w:val="single" w:sz="4" w:space="0" w:color="000000"/>
+              <w:start w:val="single" w:sz="4" w:space="0" w:color="000000"/>
               <w:bottom w:val="single" w:sz="4" w:space="0" w:color="000000"/>
-              <w:right w:val="single" w:sz="4" w:space="0" w:color="000000"/>
+              <w:end w:val="single" w:sz="4" w:space="0" w:color="000000"/>
             </w:tcBorders>
             <w:shd w:fill="FFFFFF" w:val="clear"/>
           </w:tcPr>
@@ -2113,11 +2030,10 @@
               <w:widowControl w:val="false"/>
               <w:bidi w:val="0"/>
               <w:spacing w:before="140" w:after="120"/>
-              <w:jc w:val="left"/>
+              <w:jc w:val="start"/>
               <w:rPr>
                 <w:rFonts w:ascii="Arial" w:hAnsi="Arial" w:cs="Arial"/>
                 <w:b/>
-                <w:b/>
                 <w:lang w:val="en-US"/>
               </w:rPr>
             </w:pPr>
@@ -2132,11 +2048,11 @@
           </w:p>
           <w:p>
             <w:pPr>
-              <w:pStyle w:val="TextBody"/>
+              <w:pStyle w:val="BodyText"/>
               <w:widowControl w:val="false"/>
               <w:bidi w:val="0"/>
               <w:spacing w:lineRule="auto" w:line="276" w:before="0" w:after="140"/>
-              <w:jc w:val="left"/>
+              <w:jc w:val="start"/>
               <w:rPr/>
             </w:pPr>
             <w:r>
@@ -2146,11 +2062,11 @@
           </w:p>
           <w:p>
             <w:pPr>
-              <w:pStyle w:val="TextBody"/>
+              <w:pStyle w:val="BodyText"/>
               <w:widowControl w:val="false"/>
               <w:bidi w:val="0"/>
               <w:spacing w:lineRule="auto" w:line="276" w:before="0" w:after="140"/>
-              <w:jc w:val="left"/>
+              <w:jc w:val="start"/>
               <w:rPr/>
             </w:pPr>
             <w:r>
@@ -2180,11 +2096,11 @@
           </w:p>
           <w:p>
             <w:pPr>
-              <w:pStyle w:val="TextBody"/>
+              <w:pStyle w:val="BodyText"/>
               <w:widowControl w:val="false"/>
               <w:bidi w:val="0"/>
               <w:spacing w:lineRule="auto" w:line="276" w:before="0" w:after="140"/>
-              <w:jc w:val="left"/>
+              <w:jc w:val="start"/>
               <w:rPr/>
             </w:pPr>
             <w:r>
@@ -2204,10 +2120,10 @@
           </w:p>
           <w:p>
             <w:pPr>
-              <w:pStyle w:val="TextBody"/>
-              <w:widowControl w:val="false"/>
-              <w:bidi w:val="0"/>
-              <w:jc w:val="left"/>
+              <w:pStyle w:val="BodyText"/>
+              <w:widowControl w:val="false"/>
+              <w:bidi w:val="0"/>
+              <w:jc w:val="start"/>
               <w:rPr/>
             </w:pPr>
             <w:r>
@@ -2227,10 +2143,10 @@
           </w:p>
           <w:p>
             <w:pPr>
-              <w:pStyle w:val="TextBody"/>
-              <w:widowControl w:val="false"/>
-              <w:bidi w:val="0"/>
-              <w:jc w:val="left"/>
+              <w:pStyle w:val="BodyText"/>
+              <w:widowControl w:val="false"/>
+              <w:bidi w:val="0"/>
+              <w:jc w:val="start"/>
               <w:rPr/>
             </w:pPr>
             <w:r>
@@ -2242,11 +2158,11 @@
           </w:p>
           <w:p>
             <w:pPr>
-              <w:pStyle w:val="TextBody"/>
+              <w:pStyle w:val="BodyText"/>
               <w:widowControl w:val="false"/>
               <w:bidi w:val="0"/>
               <w:spacing w:lineRule="auto" w:line="276" w:before="0" w:after="140"/>
-              <w:jc w:val="left"/>
+              <w:jc w:val="start"/>
               <w:rPr/>
             </w:pPr>
             <w:r>
@@ -2256,7 +2172,7 @@
           </w:p>
           <w:p>
             <w:pPr>
-              <w:pStyle w:val="TextBody"/>
+              <w:pStyle w:val="BodyText"/>
               <w:widowControl w:val="false"/>
               <w:numPr>
                 <w:ilvl w:val="0"/>
@@ -2266,8 +2182,8 @@
                 <w:tab w:val="left" w:pos="709" w:leader="none"/>
               </w:tabs>
               <w:bidi w:val="0"/>
-              <w:ind w:left="709" w:hanging="283"/>
-              <w:jc w:val="left"/>
+              <w:ind w:hanging="283" w:start="709"/>
+              <w:jc w:val="start"/>
               <w:rPr/>
             </w:pPr>
             <w:r>
@@ -2277,7 +2193,7 @@
           </w:p>
           <w:p>
             <w:pPr>
-              <w:pStyle w:val="TextBody"/>
+              <w:pStyle w:val="BodyText"/>
               <w:widowControl w:val="false"/>
               <w:numPr>
                 <w:ilvl w:val="0"/>
@@ -2287,8 +2203,8 @@
                 <w:tab w:val="left" w:pos="709" w:leader="none"/>
               </w:tabs>
               <w:bidi w:val="0"/>
-              <w:ind w:left="709" w:hanging="283"/>
-              <w:jc w:val="left"/>
+              <w:ind w:hanging="283" w:start="709"/>
+              <w:jc w:val="start"/>
               <w:rPr/>
             </w:pPr>
             <w:r>
@@ -2298,7 +2214,7 @@
           </w:p>
           <w:p>
             <w:pPr>
-              <w:pStyle w:val="TextBody"/>
+              <w:pStyle w:val="BodyText"/>
               <w:widowControl w:val="false"/>
               <w:numPr>
                 <w:ilvl w:val="0"/>
@@ -2308,8 +2224,8 @@
                 <w:tab w:val="left" w:pos="709" w:leader="none"/>
               </w:tabs>
               <w:bidi w:val="0"/>
-              <w:ind w:left="709" w:hanging="283"/>
-              <w:jc w:val="left"/>
+              <w:ind w:hanging="283" w:start="709"/>
+              <w:jc w:val="start"/>
               <w:rPr/>
             </w:pPr>
             <w:r>
@@ -2319,7 +2235,7 @@
           </w:p>
           <w:p>
             <w:pPr>
-              <w:pStyle w:val="TextBody"/>
+              <w:pStyle w:val="BodyText"/>
               <w:widowControl w:val="false"/>
               <w:numPr>
                 <w:ilvl w:val="0"/>
@@ -2329,8 +2245,8 @@
                 <w:tab w:val="left" w:pos="709" w:leader="none"/>
               </w:tabs>
               <w:bidi w:val="0"/>
-              <w:ind w:left="709" w:hanging="283"/>
-              <w:jc w:val="left"/>
+              <w:ind w:hanging="283" w:start="709"/>
+              <w:jc w:val="start"/>
               <w:rPr/>
             </w:pPr>
             <w:r>
@@ -2340,7 +2256,7 @@
           </w:p>
           <w:p>
             <w:pPr>
-              <w:pStyle w:val="TextBody"/>
+              <w:pStyle w:val="BodyText"/>
               <w:widowControl w:val="false"/>
               <w:numPr>
                 <w:ilvl w:val="0"/>
@@ -2350,8 +2266,8 @@
                 <w:tab w:val="left" w:pos="709" w:leader="none"/>
               </w:tabs>
               <w:bidi w:val="0"/>
-              <w:ind w:left="709" w:hanging="283"/>
-              <w:jc w:val="left"/>
+              <w:ind w:hanging="283" w:start="709"/>
+              <w:jc w:val="start"/>
               <w:rPr/>
             </w:pPr>
             <w:r>
@@ -2361,7 +2277,7 @@
           </w:p>
           <w:p>
             <w:pPr>
-              <w:pStyle w:val="TextBody"/>
+              <w:pStyle w:val="BodyText"/>
               <w:widowControl w:val="false"/>
               <w:numPr>
                 <w:ilvl w:val="0"/>
@@ -2371,8 +2287,8 @@
                 <w:tab w:val="left" w:pos="709" w:leader="none"/>
               </w:tabs>
               <w:bidi w:val="0"/>
-              <w:ind w:left="709" w:hanging="283"/>
-              <w:jc w:val="left"/>
+              <w:ind w:hanging="283" w:start="709"/>
+              <w:jc w:val="start"/>
               <w:rPr/>
             </w:pPr>
             <w:r>
@@ -2382,11 +2298,11 @@
           </w:p>
           <w:p>
             <w:pPr>
-              <w:pStyle w:val="TextBody"/>
+              <w:pStyle w:val="BodyText"/>
               <w:widowControl w:val="false"/>
               <w:bidi w:val="0"/>
               <w:spacing w:lineRule="auto" w:line="276" w:before="0" w:after="140"/>
-              <w:jc w:val="left"/>
+              <w:jc w:val="start"/>
               <w:rPr/>
             </w:pPr>
             <w:r>
@@ -2401,7 +2317,7 @@
       <w:pPr>
         <w:pStyle w:val="Normal"/>
         <w:bidi w:val="0"/>
-        <w:jc w:val="left"/>
+        <w:jc w:val="start"/>
         <w:rPr/>
       </w:pPr>
       <w:r>
@@ -2412,7 +2328,7 @@
       <w:pPr>
         <w:pStyle w:val="Normal"/>
         <w:bidi w:val="0"/>
-        <w:jc w:val="left"/>
+        <w:jc w:val="start"/>
         <w:rPr/>
       </w:pPr>
       <w:r>
@@ -2422,14 +2338,14 @@
     <w:tbl>
       <w:tblPr>
         <w:tblW w:w="9350" w:type="dxa"/>
-        <w:jc w:val="left"/>
+        <w:jc w:val="start"/>
         <w:tblInd w:w="0" w:type="dxa"/>
         <w:tblLayout w:type="fixed"/>
         <w:tblCellMar>
           <w:top w:w="0" w:type="dxa"/>
-          <w:left w:w="108" w:type="dxa"/>
+          <w:start w:w="108" w:type="dxa"/>
           <w:bottom w:w="0" w:type="dxa"/>
-          <w:right w:w="108" w:type="dxa"/>
+          <w:end w:w="108" w:type="dxa"/>
         </w:tblCellMar>
       </w:tblPr>
       <w:tblGrid>
@@ -2442,9 +2358,9 @@
             <w:tcW w:w="9350" w:type="dxa"/>
             <w:tcBorders>
               <w:top w:val="single" w:sz="4" w:space="0" w:color="000000"/>
-              <w:left w:val="single" w:sz="4" w:space="0" w:color="000000"/>
+              <w:start w:val="single" w:sz="4" w:space="0" w:color="000000"/>
               <w:bottom w:val="single" w:sz="4" w:space="0" w:color="000000"/>
-              <w:right w:val="single" w:sz="4" w:space="0" w:color="000000"/>
+              <w:end w:val="single" w:sz="4" w:space="0" w:color="000000"/>
             </w:tcBorders>
             <w:shd w:fill="CCECFC" w:val="clear"/>
           </w:tcPr>
@@ -2453,10 +2369,9 @@
               <w:pStyle w:val="Normal"/>
               <w:widowControl w:val="false"/>
               <w:bidi w:val="0"/>
-              <w:jc w:val="left"/>
+              <w:jc w:val="start"/>
               <w:rPr>
                 <w:rFonts w:ascii="Arial" w:hAnsi="Arial" w:cs="Arial"/>
-                <w:b/>
                 <w:b/>
                 <w:lang w:val="en-US"/>
               </w:rPr>
@@ -2479,9 +2394,9 @@
             <w:tcW w:w="9350" w:type="dxa"/>
             <w:tcBorders>
               <w:top w:val="single" w:sz="4" w:space="0" w:color="000000"/>
-              <w:left w:val="single" w:sz="4" w:space="0" w:color="000000"/>
+              <w:start w:val="single" w:sz="4" w:space="0" w:color="000000"/>
               <w:bottom w:val="single" w:sz="4" w:space="0" w:color="000000"/>
-              <w:right w:val="single" w:sz="4" w:space="0" w:color="000000"/>
+              <w:end w:val="single" w:sz="4" w:space="0" w:color="000000"/>
             </w:tcBorders>
             <w:shd w:fill="FFFFFF" w:val="clear"/>
           </w:tcPr>
@@ -2491,11 +2406,10 @@
               <w:widowControl w:val="false"/>
               <w:bidi w:val="0"/>
               <w:spacing w:before="140" w:after="120"/>
-              <w:jc w:val="left"/>
+              <w:jc w:val="start"/>
               <w:rPr>
                 <w:rFonts w:ascii="Arial" w:hAnsi="Arial" w:cs="Arial"/>
                 <w:b/>
-                <w:b/>
                 <w:lang w:val="en-US"/>
               </w:rPr>
             </w:pPr>
@@ -2510,11 +2424,11 @@
           </w:p>
           <w:p>
             <w:pPr>
-              <w:pStyle w:val="TextBody"/>
+              <w:pStyle w:val="BodyText"/>
               <w:widowControl w:val="false"/>
               <w:bidi w:val="0"/>
               <w:spacing w:lineRule="auto" w:line="276" w:before="0" w:after="140"/>
-              <w:jc w:val="left"/>
+              <w:jc w:val="start"/>
               <w:rPr/>
             </w:pPr>
             <w:r>
@@ -2524,11 +2438,11 @@
           </w:p>
           <w:p>
             <w:pPr>
-              <w:pStyle w:val="TextBody"/>
+              <w:pStyle w:val="BodyText"/>
               <w:widowControl w:val="false"/>
               <w:bidi w:val="0"/>
               <w:spacing w:lineRule="auto" w:line="276" w:before="0" w:after="140"/>
-              <w:jc w:val="left"/>
+              <w:jc w:val="start"/>
               <w:rPr/>
             </w:pPr>
             <w:r>
@@ -2548,11 +2462,11 @@
           </w:p>
           <w:p>
             <w:pPr>
-              <w:pStyle w:val="TextBody"/>
+              <w:pStyle w:val="BodyText"/>
               <w:widowControl w:val="false"/>
               <w:bidi w:val="0"/>
               <w:spacing w:lineRule="auto" w:line="276" w:before="0" w:after="140"/>
-              <w:jc w:val="left"/>
+              <w:jc w:val="start"/>
               <w:rPr/>
             </w:pPr>
             <w:r>
@@ -2612,11 +2526,11 @@
           </w:p>
           <w:p>
             <w:pPr>
-              <w:pStyle w:val="TextBody"/>
+              <w:pStyle w:val="BodyText"/>
               <w:widowControl w:val="false"/>
               <w:bidi w:val="0"/>
               <w:spacing w:lineRule="auto" w:line="276" w:before="0" w:after="140"/>
-              <w:jc w:val="left"/>
+              <w:jc w:val="start"/>
               <w:rPr/>
             </w:pPr>
             <w:r>
@@ -2629,7 +2543,7 @@
               <w:pStyle w:val="Heading3"/>
               <w:widowControl w:val="false"/>
               <w:bidi w:val="0"/>
-              <w:jc w:val="left"/>
+              <w:jc w:val="start"/>
               <w:rPr/>
             </w:pPr>
             <w:r>
@@ -2641,11 +2555,11 @@
           </w:p>
           <w:p>
             <w:pPr>
-              <w:pStyle w:val="TextBody"/>
+              <w:pStyle w:val="BodyText"/>
               <w:widowControl w:val="false"/>
               <w:bidi w:val="0"/>
               <w:spacing w:lineRule="auto" w:line="276" w:before="0" w:after="140"/>
-              <w:jc w:val="left"/>
+              <w:jc w:val="start"/>
               <w:rPr/>
             </w:pPr>
             <w:r>
@@ -2655,7 +2569,7 @@
           </w:p>
           <w:p>
             <w:pPr>
-              <w:pStyle w:val="TextBody"/>
+              <w:pStyle w:val="BodyText"/>
               <w:widowControl w:val="false"/>
               <w:numPr>
                 <w:ilvl w:val="0"/>
@@ -2665,8 +2579,8 @@
                 <w:tab w:val="left" w:pos="709" w:leader="none"/>
               </w:tabs>
               <w:bidi w:val="0"/>
-              <w:ind w:left="709" w:hanging="283"/>
-              <w:jc w:val="left"/>
+              <w:ind w:hanging="283" w:start="709"/>
+              <w:jc w:val="start"/>
               <w:rPr/>
             </w:pPr>
             <w:r>
@@ -2676,7 +2590,7 @@
           </w:p>
           <w:p>
             <w:pPr>
-              <w:pStyle w:val="TextBody"/>
+              <w:pStyle w:val="BodyText"/>
               <w:widowControl w:val="false"/>
               <w:numPr>
                 <w:ilvl w:val="0"/>
@@ -2686,8 +2600,8 @@
                 <w:tab w:val="left" w:pos="709" w:leader="none"/>
               </w:tabs>
               <w:bidi w:val="0"/>
-              <w:ind w:left="709" w:hanging="283"/>
-              <w:jc w:val="left"/>
+              <w:ind w:hanging="283" w:start="709"/>
+              <w:jc w:val="start"/>
               <w:rPr/>
             </w:pPr>
             <w:r>
@@ -2697,7 +2611,7 @@
           </w:p>
           <w:p>
             <w:pPr>
-              <w:pStyle w:val="TextBody"/>
+              <w:pStyle w:val="BodyText"/>
               <w:widowControl w:val="false"/>
               <w:numPr>
                 <w:ilvl w:val="0"/>
@@ -2707,8 +2621,8 @@
                 <w:tab w:val="left" w:pos="709" w:leader="none"/>
               </w:tabs>
               <w:bidi w:val="0"/>
-              <w:ind w:left="709" w:hanging="283"/>
-              <w:jc w:val="left"/>
+              <w:ind w:hanging="283" w:start="709"/>
+              <w:jc w:val="start"/>
               <w:rPr/>
             </w:pPr>
             <w:r>
@@ -2718,7 +2632,7 @@
           </w:p>
           <w:p>
             <w:pPr>
-              <w:pStyle w:val="TextBody"/>
+              <w:pStyle w:val="BodyText"/>
               <w:widowControl w:val="false"/>
               <w:numPr>
                 <w:ilvl w:val="0"/>
@@ -2728,8 +2642,8 @@
                 <w:tab w:val="left" w:pos="709" w:leader="none"/>
               </w:tabs>
               <w:bidi w:val="0"/>
-              <w:ind w:left="709" w:hanging="283"/>
-              <w:jc w:val="left"/>
+              <w:ind w:hanging="283" w:start="709"/>
+              <w:jc w:val="start"/>
               <w:rPr/>
             </w:pPr>
             <w:r>
@@ -2739,7 +2653,7 @@
           </w:p>
           <w:p>
             <w:pPr>
-              <w:pStyle w:val="TextBody"/>
+              <w:pStyle w:val="BodyText"/>
               <w:widowControl w:val="false"/>
               <w:numPr>
                 <w:ilvl w:val="0"/>
@@ -2749,8 +2663,8 @@
                 <w:tab w:val="left" w:pos="709" w:leader="none"/>
               </w:tabs>
               <w:bidi w:val="0"/>
-              <w:ind w:left="709" w:hanging="283"/>
-              <w:jc w:val="left"/>
+              <w:ind w:hanging="283" w:start="709"/>
+              <w:jc w:val="start"/>
               <w:rPr/>
             </w:pPr>
             <w:r>
@@ -2760,11 +2674,11 @@
           </w:p>
           <w:p>
             <w:pPr>
-              <w:pStyle w:val="TextBody"/>
+              <w:pStyle w:val="BodyText"/>
               <w:widowControl w:val="false"/>
               <w:bidi w:val="0"/>
               <w:spacing w:lineRule="auto" w:line="276" w:before="0" w:after="140"/>
-              <w:jc w:val="left"/>
+              <w:jc w:val="start"/>
               <w:rPr/>
             </w:pPr>
             <w:r>
@@ -2779,7 +2693,7 @@
       <w:pPr>
         <w:pStyle w:val="Normal"/>
         <w:bidi w:val="0"/>
-        <w:jc w:val="left"/>
+        <w:jc w:val="start"/>
         <w:rPr/>
       </w:pPr>
       <w:r>
@@ -2789,14 +2703,14 @@
     <w:tbl>
       <w:tblPr>
         <w:tblW w:w="9264" w:type="dxa"/>
-        <w:jc w:val="left"/>
+        <w:jc w:val="start"/>
         <w:tblInd w:w="86" w:type="dxa"/>
         <w:tblLayout w:type="fixed"/>
         <w:tblCellMar>
           <w:top w:w="0" w:type="dxa"/>
-          <w:left w:w="108" w:type="dxa"/>
+          <w:start w:w="108" w:type="dxa"/>
           <w:bottom w:w="0" w:type="dxa"/>
-          <w:right w:w="108" w:type="dxa"/>
+          <w:end w:w="108" w:type="dxa"/>
         </w:tblCellMar>
       </w:tblPr>
       <w:tblGrid>
@@ -2809,9 +2723,9 @@
             <w:tcW w:w="9264" w:type="dxa"/>
             <w:tcBorders>
               <w:top w:val="single" w:sz="4" w:space="0" w:color="000000"/>
-              <w:left w:val="single" w:sz="4" w:space="0" w:color="000000"/>
+              <w:start w:val="single" w:sz="4" w:space="0" w:color="000000"/>
               <w:bottom w:val="single" w:sz="4" w:space="0" w:color="000000"/>
-              <w:right w:val="single" w:sz="4" w:space="0" w:color="000000"/>
+              <w:end w:val="single" w:sz="4" w:space="0" w:color="000000"/>
             </w:tcBorders>
             <w:shd w:fill="CCECFC" w:val="clear"/>
           </w:tcPr>
@@ -2820,10 +2734,9 @@
               <w:pStyle w:val="Normal"/>
               <w:widowControl w:val="false"/>
               <w:bidi w:val="0"/>
-              <w:jc w:val="left"/>
+              <w:jc w:val="start"/>
               <w:rPr>
                 <w:rFonts w:ascii="Arial" w:hAnsi="Arial" w:cs="Arial"/>
-                <w:b/>
                 <w:b/>
                 <w:lang w:val="en-US"/>
               </w:rPr>
@@ -2846,9 +2759,9 @@
             <w:tcW w:w="9264" w:type="dxa"/>
             <w:tcBorders>
               <w:top w:val="single" w:sz="4" w:space="0" w:color="000000"/>
-              <w:left w:val="single" w:sz="4" w:space="0" w:color="000000"/>
+              <w:start w:val="single" w:sz="4" w:space="0" w:color="000000"/>
               <w:bottom w:val="single" w:sz="4" w:space="0" w:color="000000"/>
-              <w:right w:val="single" w:sz="4" w:space="0" w:color="000000"/>
+              <w:end w:val="single" w:sz="4" w:space="0" w:color="000000"/>
             </w:tcBorders>
             <w:shd w:fill="FFFFFF" w:val="clear"/>
           </w:tcPr>
@@ -2858,11 +2771,10 @@
               <w:widowControl w:val="false"/>
               <w:bidi w:val="0"/>
               <w:spacing w:before="140" w:after="120"/>
-              <w:jc w:val="left"/>
+              <w:jc w:val="start"/>
               <w:rPr>
                 <w:rFonts w:ascii="Arial" w:hAnsi="Arial" w:cs="Arial"/>
                 <w:b/>
-                <w:b/>
                 <w:lang w:val="en-US"/>
               </w:rPr>
             </w:pPr>
@@ -2877,11 +2789,11 @@
           </w:p>
           <w:p>
             <w:pPr>
-              <w:pStyle w:val="TextBody"/>
+              <w:pStyle w:val="BodyText"/>
               <w:widowControl w:val="false"/>
               <w:bidi w:val="0"/>
               <w:spacing w:lineRule="auto" w:line="276" w:before="0" w:after="140"/>
-              <w:jc w:val="left"/>
+              <w:jc w:val="start"/>
               <w:rPr/>
             </w:pPr>
             <w:r>
@@ -2891,11 +2803,11 @@
           </w:p>
           <w:p>
             <w:pPr>
-              <w:pStyle w:val="TextBody"/>
+              <w:pStyle w:val="BodyText"/>
               <w:widowControl w:val="false"/>
               <w:bidi w:val="0"/>
               <w:spacing w:lineRule="auto" w:line="276" w:before="0" w:after="140"/>
-              <w:jc w:val="left"/>
+              <w:jc w:val="start"/>
               <w:rPr/>
             </w:pPr>
             <w:r>
@@ -2945,11 +2857,11 @@
           </w:p>
           <w:p>
             <w:pPr>
-              <w:pStyle w:val="TextBody"/>
+              <w:pStyle w:val="BodyText"/>
               <w:widowControl w:val="false"/>
               <w:bidi w:val="0"/>
               <w:spacing w:lineRule="auto" w:line="276" w:before="0" w:after="140"/>
-              <w:jc w:val="left"/>
+              <w:jc w:val="start"/>
               <w:rPr/>
             </w:pPr>
             <w:r>
@@ -2959,10 +2871,10 @@
           </w:p>
           <w:p>
             <w:pPr>
-              <w:pStyle w:val="TextBody"/>
-              <w:widowControl w:val="false"/>
-              <w:bidi w:val="0"/>
-              <w:jc w:val="left"/>
+              <w:pStyle w:val="BodyText"/>
+              <w:widowControl w:val="false"/>
+              <w:bidi w:val="0"/>
+              <w:jc w:val="start"/>
               <w:rPr/>
             </w:pPr>
             <w:r>
@@ -2972,10 +2884,10 @@
           </w:p>
           <w:p>
             <w:pPr>
-              <w:pStyle w:val="TextBody"/>
-              <w:widowControl w:val="false"/>
-              <w:bidi w:val="0"/>
-              <w:jc w:val="left"/>
+              <w:pStyle w:val="BodyText"/>
+              <w:widowControl w:val="false"/>
+              <w:bidi w:val="0"/>
+              <w:jc w:val="start"/>
               <w:rPr/>
             </w:pPr>
             <w:r>
@@ -2987,11 +2899,11 @@
           </w:p>
           <w:p>
             <w:pPr>
-              <w:pStyle w:val="TextBody"/>
+              <w:pStyle w:val="BodyText"/>
               <w:widowControl w:val="false"/>
               <w:bidi w:val="0"/>
               <w:spacing w:lineRule="auto" w:line="276" w:before="0" w:after="140"/>
-              <w:jc w:val="left"/>
+              <w:jc w:val="start"/>
               <w:rPr/>
             </w:pPr>
             <w:r>
@@ -3001,7 +2913,7 @@
           </w:p>
           <w:p>
             <w:pPr>
-              <w:pStyle w:val="TextBody"/>
+              <w:pStyle w:val="BodyText"/>
               <w:widowControl w:val="false"/>
               <w:numPr>
                 <w:ilvl w:val="0"/>
@@ -3011,8 +2923,8 @@
                 <w:tab w:val="left" w:pos="709" w:leader="none"/>
               </w:tabs>
               <w:bidi w:val="0"/>
-              <w:ind w:left="709" w:hanging="283"/>
-              <w:jc w:val="left"/>
+              <w:ind w:hanging="283" w:start="709"/>
+              <w:jc w:val="start"/>
               <w:rPr/>
             </w:pPr>
             <w:r>
@@ -3022,7 +2934,7 @@
           </w:p>
           <w:p>
             <w:pPr>
-              <w:pStyle w:val="TextBody"/>
+              <w:pStyle w:val="BodyText"/>
               <w:widowControl w:val="false"/>
               <w:numPr>
                 <w:ilvl w:val="0"/>
@@ -3032,8 +2944,8 @@
                 <w:tab w:val="left" w:pos="709" w:leader="none"/>
               </w:tabs>
               <w:bidi w:val="0"/>
-              <w:ind w:left="709" w:hanging="283"/>
-              <w:jc w:val="left"/>
+              <w:ind w:hanging="283" w:start="709"/>
+              <w:jc w:val="start"/>
               <w:rPr/>
             </w:pPr>
             <w:r>
@@ -3043,7 +2955,7 @@
           </w:p>
           <w:p>
             <w:pPr>
-              <w:pStyle w:val="TextBody"/>
+              <w:pStyle w:val="BodyText"/>
               <w:widowControl w:val="false"/>
               <w:numPr>
                 <w:ilvl w:val="0"/>
@@ -3053,8 +2965,8 @@
                 <w:tab w:val="left" w:pos="709" w:leader="none"/>
               </w:tabs>
               <w:bidi w:val="0"/>
-              <w:ind w:left="709" w:hanging="283"/>
-              <w:jc w:val="left"/>
+              <w:ind w:hanging="283" w:start="709"/>
+              <w:jc w:val="start"/>
               <w:rPr/>
             </w:pPr>
             <w:r>
@@ -3064,7 +2976,7 @@
           </w:p>
           <w:p>
             <w:pPr>
-              <w:pStyle w:val="TextBody"/>
+              <w:pStyle w:val="BodyText"/>
               <w:widowControl w:val="false"/>
               <w:numPr>
                 <w:ilvl w:val="0"/>
@@ -3074,8 +2986,8 @@
                 <w:tab w:val="left" w:pos="709" w:leader="none"/>
               </w:tabs>
               <w:bidi w:val="0"/>
-              <w:ind w:left="709" w:hanging="283"/>
-              <w:jc w:val="left"/>
+              <w:ind w:hanging="283" w:start="709"/>
+              <w:jc w:val="start"/>
               <w:rPr/>
             </w:pPr>
             <w:r>
@@ -3085,7 +2997,7 @@
           </w:p>
           <w:p>
             <w:pPr>
-              <w:pStyle w:val="TextBody"/>
+              <w:pStyle w:val="BodyText"/>
               <w:widowControl w:val="false"/>
               <w:numPr>
                 <w:ilvl w:val="0"/>
@@ -3095,8 +3007,8 @@
                 <w:tab w:val="left" w:pos="709" w:leader="none"/>
               </w:tabs>
               <w:bidi w:val="0"/>
-              <w:ind w:left="709" w:hanging="283"/>
-              <w:jc w:val="left"/>
+              <w:ind w:hanging="283" w:start="709"/>
+              <w:jc w:val="start"/>
               <w:rPr/>
             </w:pPr>
             <w:r>
@@ -3106,11 +3018,11 @@
           </w:p>
           <w:p>
             <w:pPr>
-              <w:pStyle w:val="TextBody"/>
+              <w:pStyle w:val="BodyText"/>
               <w:widowControl w:val="false"/>
               <w:bidi w:val="0"/>
               <w:spacing w:lineRule="auto" w:line="276" w:before="0" w:after="140"/>
-              <w:jc w:val="left"/>
+              <w:jc w:val="start"/>
               <w:rPr/>
             </w:pPr>
             <w:r>
@@ -3125,7 +3037,7 @@
       <w:pPr>
         <w:pStyle w:val="Normal"/>
         <w:bidi w:val="0"/>
-        <w:jc w:val="left"/>
+        <w:jc w:val="start"/>
         <w:rPr/>
       </w:pPr>
       <w:r>
@@ -3133,8 +3045,12 @@
       </w:r>
     </w:p>
     <w:sectPr>
+      <w:headerReference w:type="even" r:id="rId3"/>
       <w:headerReference w:type="default" r:id="rId4"/>
-      <w:footerReference w:type="default" r:id="rId5"/>
+      <w:headerReference w:type="first" r:id="rId5"/>
+      <w:footerReference w:type="even" r:id="rId6"/>
+      <w:footerReference w:type="default" r:id="rId7"/>
+      <w:footerReference w:type="first" r:id="rId8"/>
       <w:type w:val="nextPage"/>
       <w:pgSz w:w="12240" w:h="15840"/>
       <w:pgMar w:left="1440" w:right="1440" w:gutter="0" w:header="0" w:top="57" w:footer="0" w:bottom="57"/>
@@ -3148,13 +3064,27 @@
 </file>
 
 <file path=word/footer1.xml><?xml version="1.0" encoding="utf-8"?>
-<w:ftr xmlns:o="urn:schemas-microsoft-com:office:office" xmlns:r="http://schemas.openxmlformats.org/officeDocument/2006/relationships" xmlns:v="urn:schemas-microsoft-com:vml" xmlns:w="http://schemas.openxmlformats.org/wordprocessingml/2006/main" xmlns:w10="urn:schemas-microsoft-com:office:word" xmlns:wp="http://schemas.openxmlformats.org/drawingml/2006/wordprocessingDrawing" xmlns:wps="http://schemas.microsoft.com/office/word/2010/wordprocessingShape" xmlns:wpg="http://schemas.microsoft.com/office/word/2010/wordprocessingGroup" xmlns:mc="http://schemas.openxmlformats.org/markup-compatibility/2006" xmlns:wp14="http://schemas.microsoft.com/office/word/2010/wordprocessingDrawing" xmlns:w14="http://schemas.microsoft.com/office/word/2010/wordml" xmlns:w15="http://schemas.microsoft.com/office/word/2012/wordml" mc:Ignorable="w14 wp14 w15">
+<w:ftr xmlns:o="urn:schemas-microsoft-com:office:office" xmlns:r="http://schemas.openxmlformats.org/officeDocument/2006/relationships" xmlns:v="urn:schemas-microsoft-com:vml" xmlns:w="http://schemas.openxmlformats.org/wordprocessingml/2006/main" xmlns:w10="urn:schemas-microsoft-com:office:word" xmlns:wp="http://schemas.openxmlformats.org/drawingml/2006/wordprocessingDrawing" xmlns:pic="http://schemas.openxmlformats.org/drawingml/2006/picture" xmlns:wps="http://schemas.microsoft.com/office/word/2010/wordprocessingShape" xmlns:wpg="http://schemas.microsoft.com/office/word/2010/wordprocessingGroup" xmlns:mc="http://schemas.openxmlformats.org/markup-compatibility/2006" xmlns:wp14="http://schemas.microsoft.com/office/word/2010/wordprocessingDrawing" xmlns:w14="http://schemas.microsoft.com/office/word/2010/wordml" xmlns:w15="http://schemas.microsoft.com/office/word/2012/wordml" mc:Ignorable="w14 wp14 w15">
+  <w:p>
+    <w:pPr>
+      <w:pStyle w:val="Footer"/>
+      <w:rPr/>
+    </w:pPr>
+    <w:r>
+      <w:rPr/>
+    </w:r>
+  </w:p>
+</w:ftr>
+</file>
+
+<file path=word/footer2.xml><?xml version="1.0" encoding="utf-8"?>
+<w:ftr xmlns:o="urn:schemas-microsoft-com:office:office" xmlns:r="http://schemas.openxmlformats.org/officeDocument/2006/relationships" xmlns:v="urn:schemas-microsoft-com:vml" xmlns:w="http://schemas.openxmlformats.org/wordprocessingml/2006/main" xmlns:w10="urn:schemas-microsoft-com:office:word" xmlns:wp="http://schemas.openxmlformats.org/drawingml/2006/wordprocessingDrawing" xmlns:pic="http://schemas.openxmlformats.org/drawingml/2006/picture" xmlns:wps="http://schemas.microsoft.com/office/word/2010/wordprocessingShape" xmlns:wpg="http://schemas.microsoft.com/office/word/2010/wordprocessingGroup" xmlns:mc="http://schemas.openxmlformats.org/markup-compatibility/2006" xmlns:wp14="http://schemas.microsoft.com/office/word/2010/wordprocessingDrawing" xmlns:w14="http://schemas.microsoft.com/office/word/2010/wordml" xmlns:w15="http://schemas.microsoft.com/office/word/2012/wordml" mc:Ignorable="w14 wp14 w15">
   <w:p>
     <w:pPr>
       <w:pStyle w:val="Normal"/>
       <w:bidi w:val="0"/>
-      <w:ind w:left="0" w:right="360" w:hanging="0"/>
-      <w:jc w:val="left"/>
+      <w:ind w:hanging="0" w:start="0" w:end="360"/>
+      <w:jc w:val="start"/>
       <w:rPr/>
     </w:pPr>
     <w:r>
@@ -3166,36 +3096,36 @@
       <w:pStyle w:val="Footer"/>
       <w:bidi w:val="0"/>
       <w:spacing w:lineRule="auto" w:line="240" w:before="0" w:after="0"/>
-      <w:jc w:val="left"/>
+      <w:jc w:val="start"/>
       <w:rPr/>
     </w:pPr>
     <w:r>
       <w:rPr>
-        <w:rStyle w:val="Pagenumber"/>
+        <w:rStyle w:val="PageNumber"/>
       </w:rPr>
       <w:fldChar w:fldCharType="begin"/>
     </w:r>
     <w:r>
       <w:rPr>
-        <w:rStyle w:val="Pagenumber"/>
+        <w:rStyle w:val="PageNumber"/>
       </w:rPr>
       <w:instrText xml:space="preserve"> PAGE </w:instrText>
     </w:r>
     <w:r>
       <w:rPr>
-        <w:rStyle w:val="Pagenumber"/>
+        <w:rStyle w:val="PageNumber"/>
       </w:rPr>
       <w:fldChar w:fldCharType="separate"/>
     </w:r>
     <w:r>
       <w:rPr>
-        <w:rStyle w:val="Pagenumber"/>
+        <w:rStyle w:val="PageNumber"/>
       </w:rPr>
       <w:t>7</w:t>
     </w:r>
     <w:r>
       <w:rPr>
-        <w:rStyle w:val="Pagenumber"/>
+        <w:rStyle w:val="PageNumber"/>
       </w:rPr>
       <w:fldChar w:fldCharType="end"/>
     </w:r>
@@ -3203,19 +3133,19 @@
   <w:tbl>
     <w:tblPr>
       <w:tblW w:w="15840" w:type="dxa"/>
-      <w:jc w:val="left"/>
+      <w:jc w:val="start"/>
       <w:tblInd w:w="-1440" w:type="dxa"/>
       <w:tblLayout w:type="fixed"/>
       <w:tblCellMar>
         <w:top w:w="86" w:type="dxa"/>
-        <w:left w:w="86" w:type="dxa"/>
+        <w:start w:w="86" w:type="dxa"/>
         <w:bottom w:w="86" w:type="dxa"/>
-        <w:right w:w="86" w:type="dxa"/>
+        <w:end w:w="86" w:type="dxa"/>
       </w:tblCellMar>
     </w:tblPr>
     <w:tblGrid>
       <w:gridCol w:w="9643"/>
-      <w:gridCol w:w="6196"/>
+      <w:gridCol w:w="6197"/>
     </w:tblGrid>
     <w:tr>
       <w:trPr>
@@ -3233,8 +3163,8 @@
             <w:pStyle w:val="Normal"/>
             <w:widowControl w:val="false"/>
             <w:bidi w:val="0"/>
-            <w:ind w:left="1354" w:right="360" w:hanging="0"/>
-            <w:jc w:val="left"/>
+            <w:ind w:hanging="0" w:start="1354" w:end="360"/>
+            <w:jc w:val="start"/>
             <w:rPr/>
           </w:pPr>
           <w:r>
@@ -3245,7 +3175,7 @@
       </w:tc>
       <w:tc>
         <w:tcPr>
-          <w:tcW w:w="6196" w:type="dxa"/>
+          <w:tcW w:w="6197" w:type="dxa"/>
           <w:tcBorders/>
           <w:shd w:fill="CCECFC" w:val="clear"/>
           <w:vAlign w:val="center"/>
@@ -3255,8 +3185,8 @@
             <w:pStyle w:val="Normal"/>
             <w:widowControl w:val="false"/>
             <w:bidi w:val="0"/>
-            <w:ind w:left="0" w:right="1249" w:hanging="0"/>
-            <w:jc w:val="right"/>
+            <w:ind w:hanging="0" w:start="0" w:end="1249"/>
+            <w:jc w:val="end"/>
             <w:rPr/>
           </w:pPr>
           <w:r>
@@ -3271,7 +3201,141 @@
       <w:pStyle w:val="Normal"/>
       <w:bidi w:val="0"/>
       <w:spacing w:lineRule="auto" w:line="240" w:before="0" w:after="0"/>
-      <w:jc w:val="left"/>
+      <w:jc w:val="start"/>
+      <w:rPr/>
+    </w:pPr>
+    <w:r>
+      <w:rPr/>
+    </w:r>
+  </w:p>
+</w:ftr>
+</file>
+
+<file path=word/footer3.xml><?xml version="1.0" encoding="utf-8"?>
+<w:ftr xmlns:o="urn:schemas-microsoft-com:office:office" xmlns:r="http://schemas.openxmlformats.org/officeDocument/2006/relationships" xmlns:v="urn:schemas-microsoft-com:vml" xmlns:w="http://schemas.openxmlformats.org/wordprocessingml/2006/main" xmlns:w10="urn:schemas-microsoft-com:office:word" xmlns:wp="http://schemas.openxmlformats.org/drawingml/2006/wordprocessingDrawing" xmlns:pic="http://schemas.openxmlformats.org/drawingml/2006/picture" xmlns:wps="http://schemas.microsoft.com/office/word/2010/wordprocessingShape" xmlns:wpg="http://schemas.microsoft.com/office/word/2010/wordprocessingGroup" xmlns:mc="http://schemas.openxmlformats.org/markup-compatibility/2006" xmlns:wp14="http://schemas.microsoft.com/office/word/2010/wordprocessingDrawing" xmlns:w14="http://schemas.microsoft.com/office/word/2010/wordml" xmlns:w15="http://schemas.microsoft.com/office/word/2012/wordml" mc:Ignorable="w14 wp14 w15">
+  <w:p>
+    <w:pPr>
+      <w:pStyle w:val="Normal"/>
+      <w:bidi w:val="0"/>
+      <w:ind w:hanging="0" w:start="0" w:end="360"/>
+      <w:jc w:val="start"/>
+      <w:rPr/>
+    </w:pPr>
+    <w:r>
+      <w:rPr/>
+    </w:r>
+  </w:p>
+  <w:p>
+    <w:pPr>
+      <w:pStyle w:val="Footer"/>
+      <w:bidi w:val="0"/>
+      <w:spacing w:lineRule="auto" w:line="240" w:before="0" w:after="0"/>
+      <w:jc w:val="start"/>
+      <w:rPr/>
+    </w:pPr>
+    <w:r>
+      <w:rPr>
+        <w:rStyle w:val="PageNumber"/>
+      </w:rPr>
+      <w:fldChar w:fldCharType="begin"/>
+    </w:r>
+    <w:r>
+      <w:rPr>
+        <w:rStyle w:val="PageNumber"/>
+      </w:rPr>
+      <w:instrText xml:space="preserve"> PAGE </w:instrText>
+    </w:r>
+    <w:r>
+      <w:rPr>
+        <w:rStyle w:val="PageNumber"/>
+      </w:rPr>
+      <w:fldChar w:fldCharType="separate"/>
+    </w:r>
+    <w:r>
+      <w:rPr>
+        <w:rStyle w:val="PageNumber"/>
+      </w:rPr>
+      <w:t>7</w:t>
+    </w:r>
+    <w:r>
+      <w:rPr>
+        <w:rStyle w:val="PageNumber"/>
+      </w:rPr>
+      <w:fldChar w:fldCharType="end"/>
+    </w:r>
+  </w:p>
+  <w:tbl>
+    <w:tblPr>
+      <w:tblW w:w="15840" w:type="dxa"/>
+      <w:jc w:val="start"/>
+      <w:tblInd w:w="-1440" w:type="dxa"/>
+      <w:tblLayout w:type="fixed"/>
+      <w:tblCellMar>
+        <w:top w:w="86" w:type="dxa"/>
+        <w:start w:w="86" w:type="dxa"/>
+        <w:bottom w:w="86" w:type="dxa"/>
+        <w:end w:w="86" w:type="dxa"/>
+      </w:tblCellMar>
+    </w:tblPr>
+    <w:tblGrid>
+      <w:gridCol w:w="9643"/>
+      <w:gridCol w:w="6197"/>
+    </w:tblGrid>
+    <w:tr>
+      <w:trPr>
+        <w:trHeight w:val="361" w:hRule="atLeast"/>
+      </w:trPr>
+      <w:tc>
+        <w:tcPr>
+          <w:tcW w:w="9643" w:type="dxa"/>
+          <w:tcBorders/>
+          <w:shd w:fill="CCECFC" w:val="clear"/>
+          <w:vAlign w:val="center"/>
+        </w:tcPr>
+        <w:p>
+          <w:pPr>
+            <w:pStyle w:val="Normal"/>
+            <w:widowControl w:val="false"/>
+            <w:bidi w:val="0"/>
+            <w:ind w:hanging="0" w:start="1354" w:end="360"/>
+            <w:jc w:val="start"/>
+            <w:rPr/>
+          </w:pPr>
+          <w:r>
+            <w:rPr/>
+            <w:t>fedramp.gov</w:t>
+          </w:r>
+        </w:p>
+      </w:tc>
+      <w:tc>
+        <w:tcPr>
+          <w:tcW w:w="6197" w:type="dxa"/>
+          <w:tcBorders/>
+          <w:shd w:fill="CCECFC" w:val="clear"/>
+          <w:vAlign w:val="center"/>
+        </w:tcPr>
+        <w:p>
+          <w:pPr>
+            <w:pStyle w:val="Normal"/>
+            <w:widowControl w:val="false"/>
+            <w:bidi w:val="0"/>
+            <w:ind w:hanging="0" w:start="0" w:end="1249"/>
+            <w:jc w:val="end"/>
+            <w:rPr/>
+          </w:pPr>
+          <w:r>
+            <w:rPr/>
+          </w:r>
+        </w:p>
+      </w:tc>
+    </w:tr>
+  </w:tbl>
+  <w:p>
+    <w:pPr>
+      <w:pStyle w:val="Normal"/>
+      <w:bidi w:val="0"/>
+      <w:spacing w:lineRule="auto" w:line="240" w:before="0" w:after="0"/>
+      <w:jc w:val="start"/>
       <w:rPr/>
     </w:pPr>
     <w:r>
@@ -3282,13 +3346,28 @@
 </file>
 
 <file path=word/header1.xml><?xml version="1.0" encoding="utf-8"?>
-<w:hdr xmlns:o="urn:schemas-microsoft-com:office:office" xmlns:r="http://schemas.openxmlformats.org/officeDocument/2006/relationships" xmlns:v="urn:schemas-microsoft-com:vml" xmlns:w="http://schemas.openxmlformats.org/wordprocessingml/2006/main" xmlns:w10="urn:schemas-microsoft-com:office:word" xmlns:wp="http://schemas.openxmlformats.org/drawingml/2006/wordprocessingDrawing" xmlns:wps="http://schemas.microsoft.com/office/word/2010/wordprocessingShape" xmlns:wpg="http://schemas.microsoft.com/office/word/2010/wordprocessingGroup" xmlns:mc="http://schemas.openxmlformats.org/markup-compatibility/2006" xmlns:wp14="http://schemas.microsoft.com/office/word/2010/wordprocessingDrawing" xmlns:w14="http://schemas.microsoft.com/office/word/2010/wordml" xmlns:w15="http://schemas.microsoft.com/office/word/2012/wordml" mc:Ignorable="w14 wp14 w15">
+<w:hdr xmlns:o="urn:schemas-microsoft-com:office:office" xmlns:r="http://schemas.openxmlformats.org/officeDocument/2006/relationships" xmlns:v="urn:schemas-microsoft-com:vml" xmlns:w="http://schemas.openxmlformats.org/wordprocessingml/2006/main" xmlns:w10="urn:schemas-microsoft-com:office:word" xmlns:wp="http://schemas.openxmlformats.org/drawingml/2006/wordprocessingDrawing" xmlns:pic="http://schemas.openxmlformats.org/drawingml/2006/picture" xmlns:wps="http://schemas.microsoft.com/office/word/2010/wordprocessingShape" xmlns:wpg="http://schemas.microsoft.com/office/word/2010/wordprocessingGroup" xmlns:mc="http://schemas.openxmlformats.org/markup-compatibility/2006" xmlns:wp14="http://schemas.microsoft.com/office/word/2010/wordprocessingDrawing" xmlns:w14="http://schemas.microsoft.com/office/word/2010/wordml" xmlns:w15="http://schemas.microsoft.com/office/word/2012/wordml" mc:Ignorable="w14 wp14 w15">
+  <w:p>
+    <w:pPr>
+      <w:pStyle w:val="Header"/>
+      <w:spacing w:before="80" w:after="0"/>
+      <w:rPr/>
+    </w:pPr>
+    <w:r>
+      <w:rPr/>
+    </w:r>
+  </w:p>
+</w:hdr>
+</file>
+
+<file path=word/header2.xml><?xml version="1.0" encoding="utf-8"?>
+<w:hdr xmlns:o="urn:schemas-microsoft-com:office:office" xmlns:r="http://schemas.openxmlformats.org/officeDocument/2006/relationships" xmlns:v="urn:schemas-microsoft-com:vml" xmlns:w="http://schemas.openxmlformats.org/wordprocessingml/2006/main" xmlns:w10="urn:schemas-microsoft-com:office:word" xmlns:wp="http://schemas.openxmlformats.org/drawingml/2006/wordprocessingDrawing" xmlns:pic="http://schemas.openxmlformats.org/drawingml/2006/picture" xmlns:wps="http://schemas.microsoft.com/office/word/2010/wordprocessingShape" xmlns:wpg="http://schemas.microsoft.com/office/word/2010/wordprocessingGroup" xmlns:mc="http://schemas.openxmlformats.org/markup-compatibility/2006" xmlns:wp14="http://schemas.microsoft.com/office/word/2010/wordprocessingDrawing" xmlns:w14="http://schemas.microsoft.com/office/word/2010/wordml" xmlns:w15="http://schemas.microsoft.com/office/word/2012/wordml" mc:Ignorable="w14 wp14 w15">
   <w:p>
     <w:pPr>
       <w:pStyle w:val="Normal"/>
       <w:bidi w:val="0"/>
       <w:spacing w:lineRule="auto" w:line="240" w:before="0" w:after="0"/>
-      <w:jc w:val="left"/>
+      <w:jc w:val="start"/>
       <w:rPr/>
     </w:pPr>
     <w:r>
@@ -3298,19 +3377,19 @@
   <w:tbl>
     <w:tblPr>
       <w:tblW w:w="12235" w:type="dxa"/>
-      <w:jc w:val="left"/>
+      <w:jc w:val="start"/>
       <w:tblInd w:w="-1440" w:type="dxa"/>
       <w:tblLayout w:type="fixed"/>
       <w:tblCellMar>
         <w:top w:w="90" w:type="dxa"/>
-        <w:left w:w="90" w:type="dxa"/>
+        <w:start w:w="90" w:type="dxa"/>
         <w:bottom w:w="90" w:type="dxa"/>
-        <w:right w:w="90" w:type="dxa"/>
+        <w:end w:w="90" w:type="dxa"/>
       </w:tblCellMar>
     </w:tblPr>
     <w:tblGrid>
       <w:gridCol w:w="2783"/>
-      <w:gridCol w:w="9451"/>
+      <w:gridCol w:w="9452"/>
     </w:tblGrid>
     <w:tr>
       <w:trPr>
@@ -3321,9 +3400,9 @@
           <w:tcW w:w="2783" w:type="dxa"/>
           <w:tcBorders>
             <w:top w:val="single" w:sz="12" w:space="0" w:color="1A4480"/>
-            <w:left w:val="single" w:sz="4" w:space="0" w:color="000000"/>
+            <w:start w:val="single" w:sz="4" w:space="0" w:color="000000"/>
             <w:bottom w:val="single" w:sz="4" w:space="0" w:color="000000"/>
-            <w:right w:val="single" w:sz="12" w:space="0" w:color="1A4480"/>
+            <w:end w:val="single" w:sz="12" w:space="0" w:color="1A4480"/>
           </w:tcBorders>
           <w:shd w:fill="1A4480" w:val="clear"/>
           <w:vAlign w:val="center"/>
@@ -3333,8 +3412,8 @@
             <w:pStyle w:val="Normal"/>
             <w:widowControl w:val="false"/>
             <w:bidi w:val="0"/>
-            <w:ind w:left="1340" w:right="1305" w:hanging="0"/>
-            <w:jc w:val="left"/>
+            <w:ind w:hanging="0" w:start="1340" w:end="1305"/>
+            <w:jc w:val="start"/>
             <w:rPr/>
           </w:pPr>
           <w:r>
@@ -3343,7 +3422,7 @@
               <wp:inline distT="0" distB="0" distL="0" distR="0">
                 <wp:extent cx="676275" cy="447675"/>
                 <wp:effectExtent l="0" t="0" r="0" b="0"/>
-                <wp:docPr id="3" name="Image1" descr=""/>
+                <wp:docPr id="2" name="Image1"/>
                 <wp:cNvGraphicFramePr>
                   <a:graphicFrameLocks xmlns:a="http://schemas.openxmlformats.org/drawingml/2006/main" noChangeAspect="1"/>
                 </wp:cNvGraphicFramePr>
@@ -3351,7 +3430,7 @@
                   <a:graphicData uri="http://schemas.openxmlformats.org/drawingml/2006/picture">
                     <pic:pic xmlns:pic="http://schemas.openxmlformats.org/drawingml/2006/picture">
                       <pic:nvPicPr>
-                        <pic:cNvPr id="3" name="Image1" descr=""/>
+                        <pic:cNvPr id="2" name="Image1"/>
                         <pic:cNvPicPr>
                           <a:picLocks noChangeAspect="1" noChangeArrowheads="1"/>
                         </pic:cNvPicPr>
@@ -3371,6 +3450,7 @@
                         <a:prstGeom prst="rect">
                           <a:avLst/>
                         </a:prstGeom>
+                        <a:noFill/>
                       </pic:spPr>
                     </pic:pic>
                   </a:graphicData>
@@ -3382,19 +3462,19 @@
       </w:tc>
       <w:tc>
         <w:tcPr>
-          <w:tcW w:w="9451" w:type="dxa"/>
+          <w:tcW w:w="9452" w:type="dxa"/>
           <w:tcBorders>
             <w:top w:val="single" w:sz="12" w:space="0" w:color="1A4480"/>
-            <w:left w:val="single" w:sz="12" w:space="0" w:color="1A4480"/>
+            <w:start w:val="single" w:sz="12" w:space="0" w:color="1A4480"/>
             <w:bottom w:val="single" w:sz="4" w:space="0" w:color="000000"/>
-            <w:right w:val="single" w:sz="12" w:space="0" w:color="1A4480"/>
+            <w:end w:val="single" w:sz="12" w:space="0" w:color="1A4480"/>
           </w:tcBorders>
           <w:shd w:fill="1A4480" w:val="clear"/>
           <w:tcMar>
             <w:top w:w="100" w:type="dxa"/>
-            <w:left w:w="100" w:type="dxa"/>
+            <w:start w:w="100" w:type="dxa"/>
             <w:bottom w:w="100" w:type="dxa"/>
-            <w:right w:w="100" w:type="dxa"/>
+            <w:end w:w="100" w:type="dxa"/>
           </w:tcMar>
           <w:vAlign w:val="center"/>
         </w:tcPr>
@@ -3404,8 +3484,8 @@
             <w:widowControl w:val="false"/>
             <w:bidi w:val="0"/>
             <w:spacing w:lineRule="auto" w:line="288" w:before="80" w:after="80"/>
-            <w:ind w:left="518" w:right="1310" w:hanging="0"/>
-            <w:jc w:val="right"/>
+            <w:ind w:hanging="0" w:start="518" w:end="1310"/>
+            <w:jc w:val="end"/>
             <w:rPr/>
           </w:pPr>
           <w:r>
@@ -3419,8 +3499,8 @@
             <w:widowControl w:val="false"/>
             <w:bidi w:val="0"/>
             <w:spacing w:lineRule="auto" w:line="288" w:before="80" w:after="80"/>
-            <w:ind w:left="518" w:right="1310" w:hanging="0"/>
-            <w:jc w:val="right"/>
+            <w:ind w:hanging="0" w:start="518" w:end="1310"/>
+            <w:jc w:val="end"/>
             <w:rPr/>
           </w:pPr>
           <w:r>
@@ -3509,8 +3589,6 @@
               <w:date w:fullDate="&lt;Insert MM/DD/YYYY&gt;T00:00:00Z">
                 <w:dateFormat w:val="M/d/yyyy"/>
                 <w:lid w:val="en-US"/>
-                <w:storeMappedDataAs w:val="dateTime"/>
-                <w:calendar w:val="gregorian"/>
               </w:date>
             </w:sdtPr>
             <w:sdtContent>
@@ -3526,12 +3604,6 @@
                   <w:szCs w:val="15"/>
                 </w:rPr>
                 <w:t>nsert MM/DD/YYYY&gt;</w:t>
-              </w:r>
-              <w:r>
-                <w:rPr>
-                  <w:sz w:val="15"/>
-                  <w:szCs w:val="15"/>
-                </w:rPr>
               </w:r>
             </w:sdtContent>
           </w:sdt>
@@ -3549,7 +3621,280 @@
       </w:tabs>
       <w:bidi w:val="0"/>
       <w:spacing w:before="80" w:after="360"/>
-      <w:jc w:val="left"/>
+      <w:jc w:val="start"/>
+      <w:rPr/>
+    </w:pPr>
+    <w:r>
+      <w:rPr/>
+      <w:tab/>
+      <w:tab/>
+    </w:r>
+  </w:p>
+</w:hdr>
+</file>
+
+<file path=word/header3.xml><?xml version="1.0" encoding="utf-8"?>
+<w:hdr xmlns:o="urn:schemas-microsoft-com:office:office" xmlns:r="http://schemas.openxmlformats.org/officeDocument/2006/relationships" xmlns:v="urn:schemas-microsoft-com:vml" xmlns:w="http://schemas.openxmlformats.org/wordprocessingml/2006/main" xmlns:w10="urn:schemas-microsoft-com:office:word" xmlns:wp="http://schemas.openxmlformats.org/drawingml/2006/wordprocessingDrawing" xmlns:pic="http://schemas.openxmlformats.org/drawingml/2006/picture" xmlns:wps="http://schemas.microsoft.com/office/word/2010/wordprocessingShape" xmlns:wpg="http://schemas.microsoft.com/office/word/2010/wordprocessingGroup" xmlns:mc="http://schemas.openxmlformats.org/markup-compatibility/2006" xmlns:wp14="http://schemas.microsoft.com/office/word/2010/wordprocessingDrawing" xmlns:w14="http://schemas.microsoft.com/office/word/2010/wordml" xmlns:w15="http://schemas.microsoft.com/office/word/2012/wordml" mc:Ignorable="w14 wp14 w15">
+  <w:p>
+    <w:pPr>
+      <w:pStyle w:val="Normal"/>
+      <w:bidi w:val="0"/>
+      <w:spacing w:lineRule="auto" w:line="240" w:before="0" w:after="0"/>
+      <w:jc w:val="start"/>
+      <w:rPr/>
+    </w:pPr>
+    <w:r>
+      <w:rPr/>
+    </w:r>
+  </w:p>
+  <w:tbl>
+    <w:tblPr>
+      <w:tblW w:w="12235" w:type="dxa"/>
+      <w:jc w:val="start"/>
+      <w:tblInd w:w="-1440" w:type="dxa"/>
+      <w:tblLayout w:type="fixed"/>
+      <w:tblCellMar>
+        <w:top w:w="90" w:type="dxa"/>
+        <w:start w:w="90" w:type="dxa"/>
+        <w:bottom w:w="90" w:type="dxa"/>
+        <w:end w:w="90" w:type="dxa"/>
+      </w:tblCellMar>
+    </w:tblPr>
+    <w:tblGrid>
+      <w:gridCol w:w="2783"/>
+      <w:gridCol w:w="9452"/>
+    </w:tblGrid>
+    <w:tr>
+      <w:trPr>
+        <w:trHeight w:val="1080" w:hRule="atLeast"/>
+      </w:trPr>
+      <w:tc>
+        <w:tcPr>
+          <w:tcW w:w="2783" w:type="dxa"/>
+          <w:tcBorders>
+            <w:top w:val="single" w:sz="12" w:space="0" w:color="1A4480"/>
+            <w:start w:val="single" w:sz="4" w:space="0" w:color="000000"/>
+            <w:bottom w:val="single" w:sz="4" w:space="0" w:color="000000"/>
+            <w:end w:val="single" w:sz="12" w:space="0" w:color="1A4480"/>
+          </w:tcBorders>
+          <w:shd w:fill="1A4480" w:val="clear"/>
+          <w:vAlign w:val="center"/>
+        </w:tcPr>
+        <w:p>
+          <w:pPr>
+            <w:pStyle w:val="Normal"/>
+            <w:widowControl w:val="false"/>
+            <w:bidi w:val="0"/>
+            <w:ind w:hanging="0" w:start="1340" w:end="1305"/>
+            <w:jc w:val="start"/>
+            <w:rPr/>
+          </w:pPr>
+          <w:r>
+            <w:rPr/>
+            <w:drawing>
+              <wp:inline distT="0" distB="0" distL="0" distR="0">
+                <wp:extent cx="676275" cy="447675"/>
+                <wp:effectExtent l="0" t="0" r="0" b="0"/>
+                <wp:docPr id="3" name="Image1"/>
+                <wp:cNvGraphicFramePr>
+                  <a:graphicFrameLocks xmlns:a="http://schemas.openxmlformats.org/drawingml/2006/main" noChangeAspect="1"/>
+                </wp:cNvGraphicFramePr>
+                <a:graphic xmlns:a="http://schemas.openxmlformats.org/drawingml/2006/main">
+                  <a:graphicData uri="http://schemas.openxmlformats.org/drawingml/2006/picture">
+                    <pic:pic xmlns:pic="http://schemas.openxmlformats.org/drawingml/2006/picture">
+                      <pic:nvPicPr>
+                        <pic:cNvPr id="3" name="Image1"/>
+                        <pic:cNvPicPr>
+                          <a:picLocks noChangeAspect="1" noChangeArrowheads="1"/>
+                        </pic:cNvPicPr>
+                      </pic:nvPicPr>
+                      <pic:blipFill>
+                        <a:blip r:embed="rId1"/>
+                        <a:srcRect l="-7906" t="-12157" r="-4314" b="-12063"/>
+                        <a:stretch>
+                          <a:fillRect/>
+                        </a:stretch>
+                      </pic:blipFill>
+                      <pic:spPr bwMode="auto">
+                        <a:xfrm>
+                          <a:off x="0" y="0"/>
+                          <a:ext cx="676275" cy="447675"/>
+                        </a:xfrm>
+                        <a:prstGeom prst="rect">
+                          <a:avLst/>
+                        </a:prstGeom>
+                        <a:noFill/>
+                      </pic:spPr>
+                    </pic:pic>
+                  </a:graphicData>
+                </a:graphic>
+              </wp:inline>
+            </w:drawing>
+          </w:r>
+        </w:p>
+      </w:tc>
+      <w:tc>
+        <w:tcPr>
+          <w:tcW w:w="9452" w:type="dxa"/>
+          <w:tcBorders>
+            <w:top w:val="single" w:sz="12" w:space="0" w:color="1A4480"/>
+            <w:start w:val="single" w:sz="12" w:space="0" w:color="1A4480"/>
+            <w:bottom w:val="single" w:sz="4" w:space="0" w:color="000000"/>
+            <w:end w:val="single" w:sz="12" w:space="0" w:color="1A4480"/>
+          </w:tcBorders>
+          <w:shd w:fill="1A4480" w:val="clear"/>
+          <w:tcMar>
+            <w:top w:w="100" w:type="dxa"/>
+            <w:start w:w="100" w:type="dxa"/>
+            <w:bottom w:w="100" w:type="dxa"/>
+            <w:end w:w="100" w:type="dxa"/>
+          </w:tcMar>
+          <w:vAlign w:val="center"/>
+        </w:tcPr>
+        <w:p>
+          <w:pPr>
+            <w:pStyle w:val="Header"/>
+            <w:widowControl w:val="false"/>
+            <w:bidi w:val="0"/>
+            <w:spacing w:lineRule="auto" w:line="288" w:before="80" w:after="80"/>
+            <w:ind w:hanging="0" w:start="518" w:end="1310"/>
+            <w:jc w:val="end"/>
+            <w:rPr/>
+          </w:pPr>
+          <w:r>
+            <w:rPr/>
+            <w:t>FedRAMP® &lt;Choose: High, Moderate, Low, LI-SaaS&gt; Baseline System Security Plan (SSP)</w:t>
+          </w:r>
+        </w:p>
+        <w:p>
+          <w:pPr>
+            <w:pStyle w:val="Header"/>
+            <w:widowControl w:val="false"/>
+            <w:bidi w:val="0"/>
+            <w:spacing w:lineRule="auto" w:line="288" w:before="80" w:after="80"/>
+            <w:ind w:hanging="0" w:start="518" w:end="1310"/>
+            <w:jc w:val="end"/>
+            <w:rPr/>
+          </w:pPr>
+          <w:r>
+            <w:rPr/>
+            <w:fldChar w:fldCharType="begin"/>
+          </w:r>
+          <w:r>
+            <w:rPr/>
+            <w:instrText xml:space="preserve"> FILLIN ""</w:instrText>
+          </w:r>
+          <w:r>
+            <w:rPr/>
+            <w:fldChar w:fldCharType="separate"/>
+          </w:r>
+          <w:r>
+            <w:rPr/>
+            <w:t>&lt;Insert CSP Name&gt;</w:t>
+          </w:r>
+          <w:r>
+            <w:rPr/>
+            <w:fldChar w:fldCharType="end"/>
+          </w:r>
+          <w:r>
+            <w:rPr>
+              <w:sz w:val="15"/>
+              <w:szCs w:val="15"/>
+            </w:rPr>
+            <w:t xml:space="preserve"> | </w:t>
+          </w:r>
+          <w:r>
+            <w:rPr/>
+            <w:fldChar w:fldCharType="begin"/>
+          </w:r>
+          <w:r>
+            <w:rPr/>
+            <w:instrText xml:space="preserve"> FILLIN ""</w:instrText>
+          </w:r>
+          <w:r>
+            <w:rPr/>
+            <w:fldChar w:fldCharType="separate"/>
+          </w:r>
+          <w:r>
+            <w:rPr/>
+            <w:t>&lt;Insert CSO Name&gt;</w:t>
+          </w:r>
+          <w:r>
+            <w:rPr/>
+            <w:fldChar w:fldCharType="end"/>
+          </w:r>
+          <w:r>
+            <w:rPr>
+              <w:sz w:val="15"/>
+              <w:szCs w:val="15"/>
+            </w:rPr>
+            <w:t xml:space="preserve"> | </w:t>
+          </w:r>
+          <w:r>
+            <w:rPr/>
+            <w:fldChar w:fldCharType="begin"/>
+          </w:r>
+          <w:r>
+            <w:rPr/>
+            <w:instrText xml:space="preserve"> FILLIN ""</w:instrText>
+          </w:r>
+          <w:r>
+            <w:rPr/>
+            <w:fldChar w:fldCharType="separate"/>
+          </w:r>
+          <w:r>
+            <w:rPr/>
+            <w:t>&lt;Insert Version X.X&gt;</w:t>
+          </w:r>
+          <w:r>
+            <w:rPr/>
+            <w:fldChar w:fldCharType="end"/>
+          </w:r>
+          <w:r>
+            <w:rPr>
+              <w:sz w:val="15"/>
+              <w:szCs w:val="15"/>
+            </w:rPr>
+            <w:t xml:space="preserve"> | &lt;I</w:t>
+          </w:r>
+          <w:sdt>
+            <w:sdtPr>
+              <w:date w:fullDate="&lt;Insert MM/DD/YYYY&gt;T00:00:00Z">
+                <w:dateFormat w:val="M/d/yyyy"/>
+                <w:lid w:val="en-US"/>
+              </w:date>
+            </w:sdtPr>
+            <w:sdtContent>
+              <w:r>
+                <w:rPr>
+                  <w:sz w:val="15"/>
+                  <w:szCs w:val="15"/>
+                </w:rPr>
+              </w:r>
+              <w:r>
+                <w:rPr>
+                  <w:sz w:val="15"/>
+                  <w:szCs w:val="15"/>
+                </w:rPr>
+                <w:t>nsert MM/DD/YYYY&gt;</w:t>
+              </w:r>
+            </w:sdtContent>
+          </w:sdt>
+        </w:p>
+      </w:tc>
+    </w:tr>
+  </w:tbl>
+  <w:p>
+    <w:pPr>
+      <w:pStyle w:val="Normal"/>
+      <w:tabs>
+        <w:tab w:val="clear" w:pos="709"/>
+        <w:tab w:val="left" w:pos="3645" w:leader="none"/>
+        <w:tab w:val="left" w:pos="6463" w:leader="none"/>
+      </w:tabs>
+      <w:bidi w:val="0"/>
+      <w:spacing w:before="80" w:after="360"/>
+      <w:jc w:val="start"/>
       <w:rPr/>
     </w:pPr>
     <w:r>
@@ -3569,12 +3914,12 @@
       <w:numFmt w:val="none"/>
       <w:suff w:val="nothing"/>
       <w:lvlText w:val="%1"/>
-      <w:lvlJc w:val="left"/>
+      <w:lvlJc w:val="start"/>
       <w:pPr>
         <w:tabs>
           <w:tab w:val="num" w:pos="0"/>
         </w:tabs>
-        <w:ind w:left="0" w:hanging="0"/>
+        <w:ind w:start="0" w:hanging="0"/>
       </w:pPr>
       <w:rPr/>
     </w:lvl>
@@ -3583,12 +3928,12 @@
       <w:numFmt w:val="none"/>
       <w:suff w:val="nothing"/>
       <w:lvlText w:val="%2"/>
-      <w:lvlJc w:val="left"/>
+      <w:lvlJc w:val="start"/>
       <w:pPr>
         <w:tabs>
           <w:tab w:val="num" w:pos="0"/>
         </w:tabs>
-        <w:ind w:left="0" w:hanging="0"/>
+        <w:ind w:start="0" w:hanging="0"/>
       </w:pPr>
       <w:rPr/>
     </w:lvl>
@@ -3597,12 +3942,12 @@
       <w:numFmt w:val="none"/>
       <w:suff w:val="nothing"/>
       <w:lvlText w:val="%3"/>
-      <w:lvlJc w:val="left"/>
+      <w:lvlJc w:val="start"/>
       <w:pPr>
         <w:tabs>
           <w:tab w:val="num" w:pos="0"/>
         </w:tabs>
-        <w:ind w:left="0" w:hanging="0"/>
+        <w:ind w:start="0" w:hanging="0"/>
       </w:pPr>
       <w:rPr/>
     </w:lvl>
@@ -3611,12 +3956,12 @@
       <w:numFmt w:val="none"/>
       <w:suff w:val="nothing"/>
       <w:lvlText w:val="%4"/>
-      <w:lvlJc w:val="left"/>
+      <w:lvlJc w:val="start"/>
       <w:pPr>
         <w:tabs>
           <w:tab w:val="num" w:pos="0"/>
         </w:tabs>
-        <w:ind w:left="0" w:hanging="0"/>
+        <w:ind w:start="0" w:hanging="0"/>
       </w:pPr>
       <w:rPr/>
     </w:lvl>
@@ -3625,12 +3970,12 @@
       <w:numFmt w:val="none"/>
       <w:suff w:val="nothing"/>
       <w:lvlText w:val="%5"/>
-      <w:lvlJc w:val="left"/>
+      <w:lvlJc w:val="start"/>
       <w:pPr>
         <w:tabs>
           <w:tab w:val="num" w:pos="0"/>
         </w:tabs>
-        <w:ind w:left="0" w:hanging="0"/>
+        <w:ind w:start="0" w:hanging="0"/>
       </w:pPr>
       <w:rPr/>
     </w:lvl>
@@ -3639,12 +3984,12 @@
       <w:numFmt w:val="none"/>
       <w:suff w:val="nothing"/>
       <w:lvlText w:val="%6"/>
-      <w:lvlJc w:val="left"/>
+      <w:lvlJc w:val="start"/>
       <w:pPr>
         <w:tabs>
           <w:tab w:val="num" w:pos="0"/>
         </w:tabs>
-        <w:ind w:left="0" w:hanging="0"/>
+        <w:ind w:start="0" w:hanging="0"/>
       </w:pPr>
       <w:rPr/>
     </w:lvl>
@@ -3653,12 +3998,12 @@
       <w:numFmt w:val="none"/>
       <w:suff w:val="nothing"/>
       <w:lvlText w:val="%7"/>
-      <w:lvlJc w:val="left"/>
+      <w:lvlJc w:val="start"/>
       <w:pPr>
         <w:tabs>
           <w:tab w:val="num" w:pos="0"/>
         </w:tabs>
-        <w:ind w:left="0" w:hanging="0"/>
+        <w:ind w:start="0" w:hanging="0"/>
       </w:pPr>
       <w:rPr/>
     </w:lvl>
@@ -3667,12 +4012,12 @@
       <w:numFmt w:val="none"/>
       <w:suff w:val="nothing"/>
       <w:lvlText w:val="%8"/>
-      <w:lvlJc w:val="left"/>
+      <w:lvlJc w:val="start"/>
       <w:pPr>
         <w:tabs>
           <w:tab w:val="num" w:pos="0"/>
         </w:tabs>
-        <w:ind w:left="0" w:hanging="0"/>
+        <w:ind w:start="0" w:hanging="0"/>
       </w:pPr>
       <w:rPr/>
     </w:lvl>
@@ -3681,12 +4026,12 @@
       <w:numFmt w:val="none"/>
       <w:suff w:val="nothing"/>
       <w:lvlText w:val="%9"/>
-      <w:lvlJc w:val="left"/>
+      <w:lvlJc w:val="start"/>
       <w:pPr>
         <w:tabs>
           <w:tab w:val="num" w:pos="0"/>
         </w:tabs>
-        <w:ind w:left="0" w:hanging="0"/>
+        <w:ind w:start="0" w:hanging="0"/>
       </w:pPr>
       <w:rPr/>
     </w:lvl>
@@ -3696,12 +4041,12 @@
       <w:start w:val="1"/>
       <w:numFmt w:val="bullet"/>
       <w:lvlText w:val=""/>
-      <w:lvlJc w:val="left"/>
+      <w:lvlJc w:val="start"/>
       <w:pPr>
         <w:tabs>
           <w:tab w:val="num" w:pos="709"/>
         </w:tabs>
-        <w:ind w:left="709" w:hanging="283"/>
+        <w:ind w:start="709" w:hanging="283"/>
       </w:pPr>
       <w:rPr>
         <w:rFonts w:ascii="Symbol" w:hAnsi="Symbol" w:cs="Symbol" w:hint="default"/>
@@ -3711,12 +4056,12 @@
       <w:start w:val="1"/>
       <w:numFmt w:val="bullet"/>
       <w:lvlText w:val=""/>
-      <w:lvlJc w:val="left"/>
+      <w:lvlJc w:val="start"/>
       <w:pPr>
         <w:tabs>
           <w:tab w:val="num" w:pos="1418"/>
         </w:tabs>
-        <w:ind w:left="1418" w:hanging="283"/>
+        <w:ind w:start="1418" w:hanging="283"/>
       </w:pPr>
       <w:rPr>
         <w:rFonts w:ascii="Symbol" w:hAnsi="Symbol" w:cs="Symbol" w:hint="default"/>
@@ -3726,12 +4071,12 @@
       <w:start w:val="1"/>
       <w:numFmt w:val="bullet"/>
       <w:lvlText w:val=""/>
-      <w:lvlJc w:val="left"/>
+      <w:lvlJc w:val="start"/>
       <w:pPr>
         <w:tabs>
           <w:tab w:val="num" w:pos="2127"/>
         </w:tabs>
-        <w:ind w:left="2127" w:hanging="283"/>
+        <w:ind w:start="2127" w:hanging="283"/>
       </w:pPr>
       <w:rPr>
         <w:rFonts w:ascii="Symbol" w:hAnsi="Symbol" w:cs="Symbol" w:hint="default"/>
@@ -3741,12 +4086,12 @@
       <w:start w:val="1"/>
       <w:numFmt w:val="bullet"/>
       <w:lvlText w:val=""/>
-      <w:lvlJc w:val="left"/>
+      <w:lvlJc w:val="start"/>
       <w:pPr>
         <w:tabs>
           <w:tab w:val="num" w:pos="2836"/>
         </w:tabs>
-        <w:ind w:left="2836" w:hanging="283"/>
+        <w:ind w:start="2836" w:hanging="283"/>
       </w:pPr>
       <w:rPr>
         <w:rFonts w:ascii="Symbol" w:hAnsi="Symbol" w:cs="Symbol" w:hint="default"/>
@@ -3756,12 +4101,12 @@
       <w:start w:val="1"/>
       <w:numFmt w:val="bullet"/>
       <w:lvlText w:val=""/>
-      <w:lvlJc w:val="left"/>
+      <w:lvlJc w:val="start"/>
       <w:pPr>
         <w:tabs>
           <w:tab w:val="num" w:pos="3545"/>
         </w:tabs>
-        <w:ind w:left="3545" w:hanging="283"/>
+        <w:ind w:start="3545" w:hanging="283"/>
       </w:pPr>
       <w:rPr>
         <w:rFonts w:ascii="Symbol" w:hAnsi="Symbol" w:cs="Symbol" w:hint="default"/>
@@ -3771,12 +4116,12 @@
       <w:start w:val="1"/>
       <w:numFmt w:val="bullet"/>
       <w:lvlText w:val=""/>
-      <w:lvlJc w:val="left"/>
+      <w:lvlJc w:val="start"/>
       <w:pPr>
         <w:tabs>
           <w:tab w:val="num" w:pos="4254"/>
         </w:tabs>
-        <w:ind w:left="4254" w:hanging="283"/>
+        <w:ind w:start="4254" w:hanging="283"/>
       </w:pPr>
       <w:rPr>
         <w:rFonts w:ascii="Symbol" w:hAnsi="Symbol" w:cs="Symbol" w:hint="default"/>
@@ -3786,12 +4131,12 @@
       <w:start w:val="1"/>
       <w:numFmt w:val="bullet"/>
       <w:lvlText w:val=""/>
-      <w:lvlJc w:val="left"/>
+      <w:lvlJc w:val="start"/>
       <w:pPr>
         <w:tabs>
           <w:tab w:val="num" w:pos="4963"/>
         </w:tabs>
-        <w:ind w:left="4963" w:hanging="283"/>
+        <w:ind w:start="4963" w:hanging="283"/>
       </w:pPr>
       <w:rPr>
         <w:rFonts w:ascii="Symbol" w:hAnsi="Symbol" w:cs="Symbol" w:hint="default"/>
@@ -3801,12 +4146,12 @@
       <w:start w:val="1"/>
       <w:numFmt w:val="bullet"/>
       <w:lvlText w:val=""/>
-      <w:lvlJc w:val="left"/>
+      <w:lvlJc w:val="start"/>
       <w:pPr>
         <w:tabs>
           <w:tab w:val="num" w:pos="5672"/>
         </w:tabs>
-        <w:ind w:left="5672" w:hanging="283"/>
+        <w:ind w:start="5672" w:hanging="283"/>
       </w:pPr>
       <w:rPr>
         <w:rFonts w:ascii="Symbol" w:hAnsi="Symbol" w:cs="Symbol" w:hint="default"/>
@@ -3816,12 +4161,12 @@
       <w:start w:val="1"/>
       <w:numFmt w:val="bullet"/>
       <w:lvlText w:val=""/>
-      <w:lvlJc w:val="left"/>
+      <w:lvlJc w:val="start"/>
       <w:pPr>
         <w:tabs>
           <w:tab w:val="num" w:pos="6381"/>
         </w:tabs>
-        <w:ind w:left="6381" w:hanging="283"/>
+        <w:ind w:start="6381" w:hanging="283"/>
       </w:pPr>
       <w:rPr>
         <w:rFonts w:ascii="Symbol" w:hAnsi="Symbol" w:cs="Symbol" w:hint="default"/>
@@ -3833,12 +4178,12 @@
       <w:start w:val="1"/>
       <w:numFmt w:val="bullet"/>
       <w:lvlText w:val=""/>
-      <w:lvlJc w:val="left"/>
+      <w:lvlJc w:val="start"/>
       <w:pPr>
         <w:tabs>
           <w:tab w:val="num" w:pos="709"/>
         </w:tabs>
-        <w:ind w:left="709" w:hanging="283"/>
+        <w:ind w:start="709" w:hanging="283"/>
       </w:pPr>
       <w:rPr>
         <w:rFonts w:ascii="Symbol" w:hAnsi="Symbol" w:cs="Symbol" w:hint="default"/>
@@ -3848,12 +4193,12 @@
       <w:start w:val="1"/>
       <w:numFmt w:val="bullet"/>
       <w:lvlText w:val=""/>
-      <w:lvlJc w:val="left"/>
+      <w:lvlJc w:val="start"/>
       <w:pPr>
         <w:tabs>
           <w:tab w:val="num" w:pos="1418"/>
         </w:tabs>
-        <w:ind w:left="1418" w:hanging="283"/>
+        <w:ind w:start="1418" w:hanging="283"/>
       </w:pPr>
       <w:rPr>
         <w:rFonts w:ascii="Symbol" w:hAnsi="Symbol" w:cs="Symbol" w:hint="default"/>
@@ -3863,12 +4208,12 @@
       <w:start w:val="1"/>
       <w:numFmt w:val="bullet"/>
       <w:lvlText w:val=""/>
-      <w:lvlJc w:val="left"/>
+      <w:lvlJc w:val="start"/>
       <w:pPr>
         <w:tabs>
           <w:tab w:val="num" w:pos="2127"/>
         </w:tabs>
-        <w:ind w:left="2127" w:hanging="283"/>
+        <w:ind w:start="2127" w:hanging="283"/>
       </w:pPr>
       <w:rPr>
         <w:rFonts w:ascii="Symbol" w:hAnsi="Symbol" w:cs="Symbol" w:hint="default"/>
@@ -3878,12 +4223,12 @@
       <w:start w:val="1"/>
       <w:numFmt w:val="bullet"/>
       <w:lvlText w:val=""/>
-      <w:lvlJc w:val="left"/>
+      <w:lvlJc w:val="start"/>
       <w:pPr>
         <w:tabs>
           <w:tab w:val="num" w:pos="2836"/>
         </w:tabs>
-        <w:ind w:left="2836" w:hanging="283"/>
+        <w:ind w:start="2836" w:hanging="283"/>
       </w:pPr>
       <w:rPr>
         <w:rFonts w:ascii="Symbol" w:hAnsi="Symbol" w:cs="Symbol" w:hint="default"/>
@@ -3893,12 +4238,12 @@
       <w:start w:val="1"/>
       <w:numFmt w:val="bullet"/>
       <w:lvlText w:val=""/>
-      <w:lvlJc w:val="left"/>
+      <w:lvlJc w:val="start"/>
       <w:pPr>
         <w:tabs>
           <w:tab w:val="num" w:pos="3545"/>
         </w:tabs>
-        <w:ind w:left="3545" w:hanging="283"/>
+        <w:ind w:start="3545" w:hanging="283"/>
       </w:pPr>
       <w:rPr>
         <w:rFonts w:ascii="Symbol" w:hAnsi="Symbol" w:cs="Symbol" w:hint="default"/>
@@ -3908,12 +4253,12 @@
       <w:start w:val="1"/>
       <w:numFmt w:val="bullet"/>
       <w:lvlText w:val=""/>
-      <w:lvlJc w:val="left"/>
+      <w:lvlJc w:val="start"/>
       <w:pPr>
         <w:tabs>
           <w:tab w:val="num" w:pos="4254"/>
         </w:tabs>
-        <w:ind w:left="4254" w:hanging="283"/>
+        <w:ind w:start="4254" w:hanging="283"/>
       </w:pPr>
       <w:rPr>
         <w:rFonts w:ascii="Symbol" w:hAnsi="Symbol" w:cs="Symbol" w:hint="default"/>
@@ -3923,12 +4268,12 @@
       <w:start w:val="1"/>
       <w:numFmt w:val="bullet"/>
       <w:lvlText w:val=""/>
-      <w:lvlJc w:val="left"/>
+      <w:lvlJc w:val="start"/>
       <w:pPr>
         <w:tabs>
           <w:tab w:val="num" w:pos="4963"/>
         </w:tabs>
-        <w:ind w:left="4963" w:hanging="283"/>
+        <w:ind w:start="4963" w:hanging="283"/>
       </w:pPr>
       <w:rPr>
         <w:rFonts w:ascii="Symbol" w:hAnsi="Symbol" w:cs="Symbol" w:hint="default"/>
@@ -3938,12 +4283,12 @@
       <w:start w:val="1"/>
       <w:numFmt w:val="bullet"/>
       <w:lvlText w:val=""/>
-      <w:lvlJc w:val="left"/>
+      <w:lvlJc w:val="start"/>
       <w:pPr>
         <w:tabs>
           <w:tab w:val="num" w:pos="5672"/>
         </w:tabs>
-        <w:ind w:left="5672" w:hanging="283"/>
+        <w:ind w:start="5672" w:hanging="283"/>
       </w:pPr>
       <w:rPr>
         <w:rFonts w:ascii="Symbol" w:hAnsi="Symbol" w:cs="Symbol" w:hint="default"/>
@@ -3953,12 +4298,12 @@
       <w:start w:val="1"/>
       <w:numFmt w:val="bullet"/>
       <w:lvlText w:val=""/>
-      <w:lvlJc w:val="left"/>
+      <w:lvlJc w:val="start"/>
       <w:pPr>
         <w:tabs>
           <w:tab w:val="num" w:pos="6381"/>
         </w:tabs>
-        <w:ind w:left="6381" w:hanging="283"/>
+        <w:ind w:start="6381" w:hanging="283"/>
       </w:pPr>
       <w:rPr>
         <w:rFonts w:ascii="Symbol" w:hAnsi="Symbol" w:cs="Symbol" w:hint="default"/>
@@ -3970,12 +4315,12 @@
       <w:start w:val="1"/>
       <w:numFmt w:val="bullet"/>
       <w:lvlText w:val=""/>
-      <w:lvlJc w:val="left"/>
+      <w:lvlJc w:val="start"/>
       <w:pPr>
         <w:tabs>
           <w:tab w:val="num" w:pos="709"/>
         </w:tabs>
-        <w:ind w:left="709" w:hanging="283"/>
+        <w:ind w:start="709" w:hanging="283"/>
       </w:pPr>
       <w:rPr>
         <w:rFonts w:ascii="Symbol" w:hAnsi="Symbol" w:cs="Symbol" w:hint="default"/>
@@ -3985,12 +4330,12 @@
       <w:start w:val="1"/>
       <w:numFmt w:val="bullet"/>
       <w:lvlText w:val=""/>
-      <w:lvlJc w:val="left"/>
+      <w:lvlJc w:val="start"/>
       <w:pPr>
         <w:tabs>
           <w:tab w:val="num" w:pos="1418"/>
         </w:tabs>
-        <w:ind w:left="1418" w:hanging="283"/>
+        <w:ind w:start="1418" w:hanging="283"/>
       </w:pPr>
       <w:rPr>
         <w:rFonts w:ascii="Symbol" w:hAnsi="Symbol" w:cs="Symbol" w:hint="default"/>
@@ -4000,12 +4345,12 @@
       <w:start w:val="1"/>
       <w:numFmt w:val="bullet"/>
       <w:lvlText w:val=""/>
-      <w:lvlJc w:val="left"/>
+      <w:lvlJc w:val="start"/>
       <w:pPr>
         <w:tabs>
           <w:tab w:val="num" w:pos="2127"/>
         </w:tabs>
-        <w:ind w:left="2127" w:hanging="283"/>
+        <w:ind w:start="2127" w:hanging="283"/>
       </w:pPr>
       <w:rPr>
         <w:rFonts w:ascii="Symbol" w:hAnsi="Symbol" w:cs="Symbol" w:hint="default"/>
@@ -4015,12 +4360,12 @@
       <w:start w:val="1"/>
       <w:numFmt w:val="bullet"/>
       <w:lvlText w:val=""/>
-      <w:lvlJc w:val="left"/>
+      <w:lvlJc w:val="start"/>
       <w:pPr>
         <w:tabs>
           <w:tab w:val="num" w:pos="2836"/>
         </w:tabs>
-        <w:ind w:left="2836" w:hanging="283"/>
+        <w:ind w:start="2836" w:hanging="283"/>
       </w:pPr>
       <w:rPr>
         <w:rFonts w:ascii="Symbol" w:hAnsi="Symbol" w:cs="Symbol" w:hint="default"/>
@@ -4030,12 +4375,12 @@
       <w:start w:val="1"/>
       <w:numFmt w:val="bullet"/>
       <w:lvlText w:val=""/>
-      <w:lvlJc w:val="left"/>
+      <w:lvlJc w:val="start"/>
       <w:pPr>
         <w:tabs>
           <w:tab w:val="num" w:pos="3545"/>
         </w:tabs>
-        <w:ind w:left="3545" w:hanging="283"/>
+        <w:ind w:start="3545" w:hanging="283"/>
       </w:pPr>
       <w:rPr>
         <w:rFonts w:ascii="Symbol" w:hAnsi="Symbol" w:cs="Symbol" w:hint="default"/>
@@ -4045,12 +4390,12 @@
       <w:start w:val="1"/>
       <w:numFmt w:val="bullet"/>
       <w:lvlText w:val=""/>
-      <w:lvlJc w:val="left"/>
+      <w:lvlJc w:val="start"/>
       <w:pPr>
         <w:tabs>
           <w:tab w:val="num" w:pos="4254"/>
         </w:tabs>
-        <w:ind w:left="4254" w:hanging="283"/>
+        <w:ind w:start="4254" w:hanging="283"/>
       </w:pPr>
       <w:rPr>
         <w:rFonts w:ascii="Symbol" w:hAnsi="Symbol" w:cs="Symbol" w:hint="default"/>
@@ -4060,12 +4405,12 @@
       <w:start w:val="1"/>
       <w:numFmt w:val="bullet"/>
       <w:lvlText w:val=""/>
-      <w:lvlJc w:val="left"/>
+      <w:lvlJc w:val="start"/>
       <w:pPr>
         <w:tabs>
           <w:tab w:val="num" w:pos="4963"/>
         </w:tabs>
-        <w:ind w:left="4963" w:hanging="283"/>
+        <w:ind w:start="4963" w:hanging="283"/>
       </w:pPr>
       <w:rPr>
         <w:rFonts w:ascii="Symbol" w:hAnsi="Symbol" w:cs="Symbol" w:hint="default"/>
@@ -4075,12 +4420,12 @@
       <w:start w:val="1"/>
       <w:numFmt w:val="bullet"/>
       <w:lvlText w:val=""/>
-      <w:lvlJc w:val="left"/>
+      <w:lvlJc w:val="start"/>
       <w:pPr>
         <w:tabs>
           <w:tab w:val="num" w:pos="5672"/>
         </w:tabs>
-        <w:ind w:left="5672" w:hanging="283"/>
+        <w:ind w:start="5672" w:hanging="283"/>
       </w:pPr>
       <w:rPr>
         <w:rFonts w:ascii="Symbol" w:hAnsi="Symbol" w:cs="Symbol" w:hint="default"/>
@@ -4090,12 +4435,12 @@
       <w:start w:val="1"/>
       <w:numFmt w:val="bullet"/>
       <w:lvlText w:val=""/>
-      <w:lvlJc w:val="left"/>
+      <w:lvlJc w:val="start"/>
       <w:pPr>
         <w:tabs>
           <w:tab w:val="num" w:pos="6381"/>
         </w:tabs>
-        <w:ind w:left="6381" w:hanging="283"/>
+        <w:ind w:start="6381" w:hanging="283"/>
       </w:pPr>
       <w:rPr>
         <w:rFonts w:ascii="Symbol" w:hAnsi="Symbol" w:cs="Symbol" w:hint="default"/>
@@ -4108,12 +4453,12 @@
       <w:numFmt w:val="none"/>
       <w:suff w:val="nothing"/>
       <w:lvlText w:val=""/>
-      <w:lvlJc w:val="left"/>
+      <w:lvlJc w:val="start"/>
       <w:pPr>
         <w:tabs>
           <w:tab w:val="num" w:pos="0"/>
         </w:tabs>
-        <w:ind w:left="0" w:hanging="0"/>
+        <w:ind w:start="0" w:hanging="0"/>
       </w:pPr>
     </w:lvl>
     <w:lvl w:ilvl="1">
@@ -4121,12 +4466,12 @@
       <w:numFmt w:val="none"/>
       <w:suff w:val="nothing"/>
       <w:lvlText w:val=""/>
-      <w:lvlJc w:val="left"/>
+      <w:lvlJc w:val="start"/>
       <w:pPr>
         <w:tabs>
           <w:tab w:val="num" w:pos="0"/>
         </w:tabs>
-        <w:ind w:left="0" w:hanging="0"/>
+        <w:ind w:start="0" w:hanging="0"/>
       </w:pPr>
     </w:lvl>
     <w:lvl w:ilvl="2">
@@ -4134,12 +4479,12 @@
       <w:numFmt w:val="none"/>
       <w:suff w:val="nothing"/>
       <w:lvlText w:val=""/>
-      <w:lvlJc w:val="left"/>
+      <w:lvlJc w:val="start"/>
       <w:pPr>
         <w:tabs>
           <w:tab w:val="num" w:pos="0"/>
         </w:tabs>
-        <w:ind w:left="0" w:hanging="0"/>
+        <w:ind w:start="0" w:hanging="0"/>
       </w:pPr>
     </w:lvl>
     <w:lvl w:ilvl="3">
@@ -4147,12 +4492,12 @@
       <w:numFmt w:val="none"/>
       <w:suff w:val="nothing"/>
       <w:lvlText w:val=""/>
-      <w:lvlJc w:val="left"/>
+      <w:lvlJc w:val="start"/>
       <w:pPr>
         <w:tabs>
           <w:tab w:val="num" w:pos="0"/>
         </w:tabs>
-        <w:ind w:left="0" w:hanging="0"/>
+        <w:ind w:start="0" w:hanging="0"/>
       </w:pPr>
     </w:lvl>
     <w:lvl w:ilvl="4">
@@ -4160,12 +4505,12 @@
       <w:numFmt w:val="none"/>
       <w:suff w:val="nothing"/>
       <w:lvlText w:val=""/>
-      <w:lvlJc w:val="left"/>
+      <w:lvlJc w:val="start"/>
       <w:pPr>
         <w:tabs>
           <w:tab w:val="num" w:pos="0"/>
         </w:tabs>
-        <w:ind w:left="0" w:hanging="0"/>
+        <w:ind w:start="0" w:hanging="0"/>
       </w:pPr>
     </w:lvl>
     <w:lvl w:ilvl="5">
@@ -4173,12 +4518,12 @@
       <w:numFmt w:val="none"/>
       <w:suff w:val="nothing"/>
       <w:lvlText w:val=""/>
-      <w:lvlJc w:val="left"/>
+      <w:lvlJc w:val="start"/>
       <w:pPr>
         <w:tabs>
           <w:tab w:val="num" w:pos="0"/>
         </w:tabs>
-        <w:ind w:left="0" w:hanging="0"/>
+        <w:ind w:start="0" w:hanging="0"/>
       </w:pPr>
     </w:lvl>
     <w:lvl w:ilvl="6">
@@ -4186,12 +4531,12 @@
       <w:numFmt w:val="none"/>
       <w:suff w:val="nothing"/>
       <w:lvlText w:val=""/>
-      <w:lvlJc w:val="left"/>
+      <w:lvlJc w:val="start"/>
       <w:pPr>
         <w:tabs>
           <w:tab w:val="num" w:pos="0"/>
         </w:tabs>
-        <w:ind w:left="0" w:hanging="0"/>
+        <w:ind w:start="0" w:hanging="0"/>
       </w:pPr>
     </w:lvl>
     <w:lvl w:ilvl="7">
@@ -4199,12 +4544,12 @@
       <w:numFmt w:val="none"/>
       <w:suff w:val="nothing"/>
       <w:lvlText w:val=""/>
-      <w:lvlJc w:val="left"/>
+      <w:lvlJc w:val="start"/>
       <w:pPr>
         <w:tabs>
           <w:tab w:val="num" w:pos="0"/>
         </w:tabs>
-        <w:ind w:left="0" w:hanging="0"/>
+        <w:ind w:start="0" w:hanging="0"/>
       </w:pPr>
     </w:lvl>
     <w:lvl w:ilvl="8">
@@ -4212,12 +4557,12 @@
       <w:numFmt w:val="none"/>
       <w:suff w:val="nothing"/>
       <w:lvlText w:val=""/>
-      <w:lvlJc w:val="left"/>
+      <w:lvlJc w:val="start"/>
       <w:pPr>
         <w:tabs>
           <w:tab w:val="num" w:pos="0"/>
         </w:tabs>
-        <w:ind w:left="0" w:hanging="0"/>
+        <w:ind w:start="0" w:hanging="0"/>
       </w:pPr>
     </w:lvl>
   </w:abstractNum>
@@ -4263,10 +4608,10 @@
     <w:pPr>
       <w:widowControl/>
       <w:suppressAutoHyphens w:val="true"/>
-      <w:overflowPunct w:val="false"/>
+      <w:overflowPunct w:val="true"/>
       <w:bidi w:val="0"/>
       <w:spacing w:before="0" w:after="0"/>
-      <w:jc w:val="left"/>
+      <w:jc w:val="start"/>
     </w:pPr>
     <w:rPr>
       <w:rFonts w:ascii="Liberation Serif" w:hAnsi="Liberation Serif" w:eastAsia="Songti SC" w:cs="Arial Unicode MS"/>
@@ -4278,7 +4623,7 @@
     </w:rPr>
   </w:style>
   <w:style w:type="paragraph" w:styleId="Heading1">
-    <w:name w:val="Heading 1"/>
+    <w:name w:val="heading 1"/>
     <w:basedOn w:val="Normal"/>
     <w:next w:val="Normal"/>
     <w:qFormat/>
@@ -4300,9 +4645,9 @@
     </w:rPr>
   </w:style>
   <w:style w:type="paragraph" w:styleId="Heading3">
-    <w:name w:val="Heading 3"/>
+    <w:name w:val="heading 3"/>
     <w:basedOn w:val="Heading"/>
-    <w:next w:val="TextBody"/>
+    <w:next w:val="BodyText"/>
     <w:qFormat/>
     <w:pPr>
       <w:spacing w:before="140" w:after="120"/>
@@ -4321,7 +4666,7 @@
     <w:qFormat/>
     <w:rPr/>
   </w:style>
-  <w:style w:type="character" w:styleId="InternetLink">
+  <w:style w:type="character" w:styleId="Hyperlink">
     <w:name w:val="Hyperlink"/>
     <w:basedOn w:val="DefaultParagraphFont"/>
     <w:rPr>
@@ -4329,7 +4674,7 @@
       <w:u w:val="single"/>
     </w:rPr>
   </w:style>
-  <w:style w:type="character" w:styleId="VisitedInternetLink">
+  <w:style w:type="character" w:styleId="FollowedHyperlink">
     <w:name w:val="FollowedHyperlink"/>
     <w:basedOn w:val="DefaultParagraphFont"/>
     <w:rPr>
@@ -4337,14 +4682,14 @@
       <w:u w:val="single"/>
     </w:rPr>
   </w:style>
-  <w:style w:type="character" w:styleId="Pagenumber">
+  <w:style w:type="character" w:styleId="PageNumber">
     <w:name w:val="page number"/>
     <w:basedOn w:val="DefaultParagraphFont"/>
     <w:qFormat/>
     <w:rPr/>
   </w:style>
-  <w:style w:type="character" w:styleId="Bullets">
-    <w:name w:val="Bullets"/>
+  <w:style w:type="character" w:styleId="Bulletsuser">
+    <w:name w:val="Bullets (user)"/>
     <w:qFormat/>
     <w:rPr>
       <w:rFonts w:ascii="OpenSymbol" w:hAnsi="OpenSymbol" w:eastAsia="OpenSymbol" w:cs="OpenSymbol"/>
@@ -4353,7 +4698,7 @@
   <w:style w:type="paragraph" w:styleId="Heading">
     <w:name w:val="Heading"/>
     <w:basedOn w:val="Normal"/>
-    <w:next w:val="TextBody"/>
+    <w:next w:val="BodyText"/>
     <w:qFormat/>
     <w:pPr>
       <w:keepNext w:val="true"/>
@@ -4365,7 +4710,7 @@
       <w:szCs w:val="28"/>
     </w:rPr>
   </w:style>
-  <w:style w:type="paragraph" w:styleId="TextBody">
+  <w:style w:type="paragraph" w:styleId="BodyText">
     <w:name w:val="Body Text"/>
     <w:basedOn w:val="Normal"/>
     <w:pPr>
@@ -4375,14 +4720,14 @@
   </w:style>
   <w:style w:type="paragraph" w:styleId="List">
     <w:name w:val="List"/>
-    <w:basedOn w:val="TextBody"/>
+    <w:basedOn w:val="BodyText"/>
     <w:pPr/>
     <w:rPr>
       <w:rFonts w:cs="Arial Unicode MS"/>
     </w:rPr>
   </w:style>
   <w:style w:type="paragraph" w:styleId="Caption">
-    <w:name w:val="Caption"/>
+    <w:name w:val="caption"/>
     <w:basedOn w:val="Normal"/>
     <w:qFormat/>
     <w:pPr>
@@ -4457,7 +4802,7 @@
       <w:color w:val="808080"/>
     </w:rPr>
   </w:style>
-  <w:style w:type="paragraph" w:styleId="Tabletitle">
+  <w:style w:type="paragraph" w:styleId="tabletitle">
     <w:name w:val="table title"/>
     <w:basedOn w:val="Normal"/>
     <w:qFormat/>
@@ -4486,12 +4831,12 @@
     <w:rPr/>
   </w:style>
   <w:style w:type="paragraph" w:styleId="Header">
-    <w:name w:val="Header"/>
+    <w:name w:val="header"/>
     <w:basedOn w:val="Normal"/>
     <w:pPr>
       <w:widowControl w:val="false"/>
       <w:spacing w:lineRule="auto" w:line="240" w:before="80" w:after="0"/>
-      <w:ind w:left="1350" w:right="1305" w:hanging="0"/>
+      <w:ind w:hanging="0" w:start="1350" w:end="1305"/>
     </w:pPr>
     <w:rPr>
       <w:color w:val="CCECFC"/>
@@ -4500,7 +4845,7 @@
     </w:rPr>
   </w:style>
   <w:style w:type="paragraph" w:styleId="Footer">
-    <w:name w:val="Footer"/>
+    <w:name w:val="footer"/>
     <w:basedOn w:val="Normal"/>
     <w:pPr>
       <w:tabs>
@@ -4523,4 +4868,110 @@
     <w:rPr/>
   </w:style>
 </w:styles>
+</file>
+
+<file path=word/theme/theme1.xml><?xml version="1.0" encoding="utf-8"?>
+<a:theme xmlns:a="http://schemas.openxmlformats.org/drawingml/2006/main" xmlns:r="http://schemas.openxmlformats.org/officeDocument/2006/relationships" name="Office">
+  <a:themeElements>
+    <a:clrScheme name="LibreOffice">
+      <a:dk1>
+        <a:srgbClr val="000000"/>
+      </a:dk1>
+      <a:lt1>
+        <a:srgbClr val="ffffff"/>
+      </a:lt1>
+      <a:dk2>
+        <a:srgbClr val="000000"/>
+      </a:dk2>
+      <a:lt2>
+        <a:srgbClr val="ffffff"/>
+      </a:lt2>
+      <a:accent1>
+        <a:srgbClr val="18a303"/>
+      </a:accent1>
+      <a:accent2>
+        <a:srgbClr val="0369a3"/>
+      </a:accent2>
+      <a:accent3>
+        <a:srgbClr val="a33e03"/>
+      </a:accent3>
+      <a:accent4>
+        <a:srgbClr val="8e03a3"/>
+      </a:accent4>
+      <a:accent5>
+        <a:srgbClr val="c99c00"/>
+      </a:accent5>
+      <a:accent6>
+        <a:srgbClr val="c9211e"/>
+      </a:accent6>
+      <a:hlink>
+        <a:srgbClr val="0000ee"/>
+      </a:hlink>
+      <a:folHlink>
+        <a:srgbClr val="551a8b"/>
+      </a:folHlink>
+    </a:clrScheme>
+    <a:fontScheme name="Office">
+      <a:majorFont>
+        <a:latin typeface="Arial" pitchFamily="0" charset="1"/>
+        <a:ea typeface="DejaVu Sans" pitchFamily="0" charset="1"/>
+        <a:cs typeface="DejaVu Sans" pitchFamily="0" charset="1"/>
+      </a:majorFont>
+      <a:minorFont>
+        <a:latin typeface="Arial" pitchFamily="0" charset="1"/>
+        <a:ea typeface="DejaVu Sans" pitchFamily="0" charset="1"/>
+        <a:cs typeface="DejaVu Sans" pitchFamily="0" charset="1"/>
+      </a:minorFont>
+    </a:fontScheme>
+    <a:fmtScheme>
+      <a:fillStyleLst>
+        <a:solidFill>
+          <a:schemeClr val="phClr"/>
+        </a:solidFill>
+        <a:solidFill>
+          <a:schemeClr val="phClr"/>
+        </a:solidFill>
+        <a:solidFill>
+          <a:schemeClr val="phClr"/>
+        </a:solidFill>
+      </a:fillStyleLst>
+      <a:lnStyleLst>
+        <a:ln w="6350" cap="flat" cmpd="sng" algn="ctr">
+          <a:prstDash val="solid"/>
+          <a:miter/>
+        </a:ln>
+        <a:ln w="6350" cap="flat" cmpd="sng" algn="ctr">
+          <a:prstDash val="solid"/>
+          <a:miter/>
+        </a:ln>
+        <a:ln w="6350" cap="flat" cmpd="sng" algn="ctr">
+          <a:prstDash val="solid"/>
+          <a:miter/>
+        </a:ln>
+      </a:lnStyleLst>
+      <a:effectStyleLst>
+        <a:effectStyle>
+          <a:effectLst/>
+        </a:effectStyle>
+        <a:effectStyle>
+          <a:effectLst/>
+        </a:effectStyle>
+        <a:effectStyle>
+          <a:effectLst/>
+        </a:effectStyle>
+      </a:effectStyleLst>
+      <a:bgFillStyleLst>
+        <a:solidFill>
+          <a:schemeClr val="phClr"/>
+        </a:solidFill>
+        <a:solidFill>
+          <a:schemeClr val="phClr"/>
+        </a:solidFill>
+        <a:solidFill>
+          <a:schemeClr val="phClr"/>
+        </a:solidFill>
+      </a:bgFillStyleLst>
+    </a:fmtScheme>
+  </a:themeElements>
+</a:theme>
 </file>
</xml_diff>